<commit_message>
Added and Updated the anime.html page
</commit_message>
<xml_diff>
--- a/cruz-site-plan (anime) (1).docx
+++ b/cruz-site-plan (anime) (1).docx
@@ -1,6 +1,6 @@
 
 <file path=word/document.xml><?xml version="1.0" encoding="utf-8"?>
-<w:document xmlns:wpc="http://schemas.microsoft.com/office/word/2010/wordprocessingCanvas" xmlns:cx="http://schemas.microsoft.com/office/drawing/2014/chartex" xmlns:cx1="http://schemas.microsoft.com/office/drawing/2015/9/8/chartex" xmlns:cx2="http://schemas.microsoft.com/office/drawing/2015/10/21/chartex" xmlns:cx3="http://schemas.microsoft.com/office/drawing/2016/5/9/chartex" xmlns:cx4="http://schemas.microsoft.com/office/drawing/2016/5/10/chartex" xmlns:cx5="http://schemas.microsoft.com/office/drawing/2016/5/11/chartex" xmlns:cx6="http://schemas.microsoft.com/office/drawing/2016/5/12/chartex" xmlns:cx7="http://schemas.microsoft.com/office/drawing/2016/5/13/chartex" xmlns:cx8="http://schemas.microsoft.com/office/drawing/2016/5/14/chartex" xmlns:mc="http://schemas.openxmlformats.org/markup-compatibility/2006" xmlns:aink="http://schemas.microsoft.com/office/drawing/2016/ink" xmlns:am3d="http://schemas.microsoft.com/office/drawing/2017/model3d" xmlns:o="urn:schemas-microsoft-com:office:office" xmlns:oel="http://schemas.microsoft.com/office/2019/extlst" xmlns:r="http://schemas.openxmlformats.org/officeDocument/2006/relationships" xmlns:m="http://schemas.openxmlformats.org/officeDocument/2006/math" xmlns:v="urn:schemas-microsoft-com:vml" xmlns:wp14="http://schemas.microsoft.com/office/word/2010/wordprocessingDrawing" xmlns:wp="http://schemas.openxmlformats.org/drawingml/2006/wordprocessingDrawing" xmlns:w10="urn:schemas-microsoft-com:office:word" xmlns:w="http://schemas.openxmlformats.org/wordprocessingml/2006/main" xmlns:w14="http://schemas.microsoft.com/office/word/2010/wordml" xmlns:w15="http://schemas.microsoft.com/office/word/2012/wordml" xmlns:w16cex="http://schemas.microsoft.com/office/word/2018/wordml/cex" xmlns:w16cid="http://schemas.microsoft.com/office/word/2016/wordml/cid" xmlns:w16="http://schemas.microsoft.com/office/word/2018/wordml" xmlns:w16du="http://schemas.microsoft.com/office/word/2023/wordml/word16du" xmlns:w16sdtdh="http://schemas.microsoft.com/office/word/2020/wordml/sdtdatahash" xmlns:w16sdtfl="http://schemas.microsoft.com/office/word/2024/wordml/sdtformatlock" xmlns:w16se="http://schemas.microsoft.com/office/word/2015/wordml/symex" xmlns:wpg="http://schemas.microsoft.com/office/word/2010/wordprocessingGroup" xmlns:wpi="http://schemas.microsoft.com/office/word/2010/wordprocessingInk" xmlns:wne="http://schemas.microsoft.com/office/word/2006/wordml" xmlns:wps="http://schemas.microsoft.com/office/word/2010/wordprocessingShape" xmlns:a="http://schemas.openxmlformats.org/drawingml/2006/main" xmlns:pic="http://schemas.openxmlformats.org/drawingml/2006/picture" xmlns:a14="http://schemas.microsoft.com/office/drawing/2010/main" mc:Ignorable="w14 w15 w16se w16cid w16 w16cex w16sdtdh w16sdtfl w16du wp14">
+<w:document xmlns:wpc="http://schemas.microsoft.com/office/word/2010/wordprocessingCanvas" xmlns:cx="http://schemas.microsoft.com/office/drawing/2014/chartex" xmlns:cx1="http://schemas.microsoft.com/office/drawing/2015/9/8/chartex" xmlns:cx2="http://schemas.microsoft.com/office/drawing/2015/10/21/chartex" xmlns:cx3="http://schemas.microsoft.com/office/drawing/2016/5/9/chartex" xmlns:cx4="http://schemas.microsoft.com/office/drawing/2016/5/10/chartex" xmlns:cx5="http://schemas.microsoft.com/office/drawing/2016/5/11/chartex" xmlns:cx6="http://schemas.microsoft.com/office/drawing/2016/5/12/chartex" xmlns:cx7="http://schemas.microsoft.com/office/drawing/2016/5/13/chartex" xmlns:cx8="http://schemas.microsoft.com/office/drawing/2016/5/14/chartex" xmlns:mc="http://schemas.openxmlformats.org/markup-compatibility/2006" xmlns:aink="http://schemas.microsoft.com/office/drawing/2016/ink" xmlns:am3d="http://schemas.microsoft.com/office/drawing/2017/model3d" xmlns:o="urn:schemas-microsoft-com:office:office" xmlns:oel="http://schemas.microsoft.com/office/2019/extlst" xmlns:r="http://schemas.openxmlformats.org/officeDocument/2006/relationships" xmlns:m="http://schemas.openxmlformats.org/officeDocument/2006/math" xmlns:v="urn:schemas-microsoft-com:vml" xmlns:wp14="http://schemas.microsoft.com/office/word/2010/wordprocessingDrawing" xmlns:wp="http://schemas.openxmlformats.org/drawingml/2006/wordprocessingDrawing" xmlns:w10="urn:schemas-microsoft-com:office:word" xmlns:w="http://schemas.openxmlformats.org/wordprocessingml/2006/main" xmlns:w14="http://schemas.microsoft.com/office/word/2010/wordml" xmlns:w15="http://schemas.microsoft.com/office/word/2012/wordml" xmlns:w16cex="http://schemas.microsoft.com/office/word/2018/wordml/cex" xmlns:w16cid="http://schemas.microsoft.com/office/word/2016/wordml/cid" xmlns:w16="http://schemas.microsoft.com/office/word/2018/wordml" xmlns:w16du="http://schemas.microsoft.com/office/word/2023/wordml/word16du" xmlns:w16sdtdh="http://schemas.microsoft.com/office/word/2020/wordml/sdtdatahash" xmlns:w16sdtfl="http://schemas.microsoft.com/office/word/2024/wordml/sdtformatlock" xmlns:w16se="http://schemas.microsoft.com/office/word/2015/wordml/symex" xmlns:wpg="http://schemas.microsoft.com/office/word/2010/wordprocessingGroup" xmlns:wpi="http://schemas.microsoft.com/office/word/2010/wordprocessingInk" xmlns:wne="http://schemas.microsoft.com/office/word/2006/wordml" xmlns:wps="http://schemas.microsoft.com/office/word/2010/wordprocessingShape" mc:Ignorable="w14 w15 w16se w16cid w16 w16cex w16sdtdh w16sdtfl w16du wp14">
   <w:body>
     <w:p>
       <w:pPr>
@@ -97,7 +97,7 @@
           <w:noProof/>
         </w:rPr>
         <w:pict w14:anchorId="75FCC9A1">
-          <v:rect id="_x0000_i1025" style="width:468pt;height:.05pt;mso-width-percent:0;mso-height-percent:0;mso-width-percent:0;mso-height-percent:0" alt="" o:hr="t" o:hrstd="t" o:hralign="center" fillcolor="#a0a0a0" stroked="f"/>
+          <v:rect id="_x0000_i1025" alt="" style="width:468pt;height:.05pt;mso-width-percent:0;mso-height-percent:0;mso-width-percent:0;mso-height-percent:0" o:hralign="center" o:hrstd="t" o:hr="t" fillcolor="#a0a0a0" stroked="f"/>
         </w:pict>
       </w:r>
     </w:p>
@@ -185,43 +185,13 @@
         <w:rPr>
           <w:rFonts w:eastAsia="Times New Roman"/>
         </w:rPr>
-        <w:t>me</w:t>
-      </w:r>
-      <w:r>
-        <w:rPr>
-          <w:rFonts w:eastAsia="Times New Roman"/>
-        </w:rPr>
-        <w:t xml:space="preserve"> </w:t>
-      </w:r>
-      <w:r>
-        <w:rPr>
-          <w:rFonts w:eastAsia="Times New Roman"/>
-        </w:rPr>
-        <w:t xml:space="preserve">fan, </w:t>
-      </w:r>
-      <w:r>
-        <w:rPr>
-          <w:rFonts w:eastAsia="Times New Roman"/>
-        </w:rPr>
-        <w:t>I’m</w:t>
-      </w:r>
-      <w:r>
-        <w:rPr>
-          <w:rFonts w:eastAsia="Times New Roman"/>
-        </w:rPr>
-        <w:t xml:space="preserve"> uniquely positioned to create this kind of tailored experience. The site stays simple and high‑level, presenting each show with clear explanations of why it matters to me. </w:t>
-      </w:r>
-      <w:r>
-        <w:rPr>
-          <w:rFonts w:eastAsia="Times New Roman"/>
-        </w:rPr>
-        <w:t>It’s</w:t>
-      </w:r>
-      <w:r>
-        <w:rPr>
-          <w:rFonts w:eastAsia="Times New Roman"/>
-        </w:rPr>
-        <w:t xml:space="preserve"> concrete, easy to navigate, and customized for anyone who wants honest, personal recommendations rather than generic lists. My goal is to spark curiosity and start conversations about the stories that inspire me." - MS Copilot</w:t>
+        <w:t xml:space="preserve">me </w:t>
+      </w:r>
+      <w:r>
+        <w:rPr>
+          <w:rFonts w:eastAsia="Times New Roman"/>
+        </w:rPr>
+        <w:t>fan, I’m uniquely positioned to create this kind of tailored experience. The site stays simple and high‑level, presenting each show with clear explanations of why it matters to me. It’s concrete, easy to navigate, and customized for anyone who wants honest, personal recommendations rather than generic lists. My goal is to spark curiosity and start conversations about the stories that inspire me." - MS Copilot</w:t>
       </w:r>
     </w:p>
     <w:p>
@@ -242,25 +212,19 @@
     <w:p>
       <w:pPr>
         <w:pStyle w:val="NormalWeb"/>
-        <w:suppressLineNumbers w:val="0"/>
-        <w:spacing w:beforeAutospacing="on" w:afterAutospacing="on" w:line="259" w:lineRule="auto"/>
-        <w:ind w:left="0" w:right="0"/>
-        <w:jc w:val="center"/>
-      </w:pPr>
-      <w:r>
-        <w:rPr/>
+        <w:spacing w:line="259" w:lineRule="auto"/>
+        <w:jc w:val="center"/>
+      </w:pPr>
+      <w:r>
         <w:t>My audience will consist of students and faculty within WDD130 class. Other than that, my audience als</w:t>
       </w:r>
       <w:r>
-        <w:rPr/>
         <w:t xml:space="preserve">o includes people who are curious about </w:t>
       </w:r>
       <w:r>
-        <w:rPr/>
         <w:t xml:space="preserve">anime </w:t>
       </w:r>
       <w:r>
-        <w:rPr/>
         <w:t>in general.</w:t>
       </w:r>
     </w:p>
@@ -277,7 +241,7 @@
           <w:noProof/>
         </w:rPr>
         <w:pict w14:anchorId="353FE91A">
-          <v:rect id="_x0000_i1026" style="width:468pt;height:.05pt;mso-width-percent:0;mso-height-percent:0;mso-width-percent:0;mso-height-percent:0" alt="" o:hr="t" o:hrstd="t" o:hralign="center" fillcolor="#a0a0a0" stroked="f"/>
+          <v:rect id="_x0000_i1026" alt="" style="width:468pt;height:.05pt;mso-width-percent:0;mso-height-percent:0;mso-width-percent:0;mso-height-percent:0" o:hralign="center" o:hrstd="t" o:hr="t" fillcolor="#a0a0a0" stroked="f"/>
         </w:pict>
       </w:r>
     </w:p>
@@ -316,23 +280,26 @@
         <w:jc w:val="center"/>
       </w:pPr>
       <w:r>
+        <w:rPr>
+          <w:noProof/>
+        </w:rPr>
         <w:drawing>
-          <wp:inline wp14:editId="21D8A038" wp14:anchorId="16A7DE0C">
+          <wp:inline distT="0" distB="0" distL="0" distR="0" wp14:anchorId="16A7DE0C" wp14:editId="21D8A038">
             <wp:extent cx="3179663" cy="1059888"/>
             <wp:effectExtent l="0" t="0" r="0" b="0"/>
             <wp:docPr id="854121677" name="drawing"/>
             <wp:cNvGraphicFramePr>
-              <a:graphicFrameLocks noChangeAspect="1"/>
+              <a:graphicFrameLocks xmlns:a="http://schemas.openxmlformats.org/drawingml/2006/main" noChangeAspect="1"/>
             </wp:cNvGraphicFramePr>
-            <a:graphic>
-              <a:graphicData xmlns:a="http://schemas.openxmlformats.org/drawingml/2006/main" uri="http://schemas.openxmlformats.org/drawingml/2006/picture">
+            <a:graphic xmlns:a="http://schemas.openxmlformats.org/drawingml/2006/main">
+              <a:graphicData uri="http://schemas.openxmlformats.org/drawingml/2006/picture">
                 <pic:pic xmlns:pic="http://schemas.openxmlformats.org/drawingml/2006/picture">
                   <pic:nvPicPr>
                     <pic:cNvPr id="854121677" name="Picture 854121677"/>
                     <pic:cNvPicPr/>
                   </pic:nvPicPr>
                   <pic:blipFill>
-                    <a:blip xmlns:r="http://schemas.openxmlformats.org/officeDocument/2006/relationships" r:embed="rId1641556024">
+                    <a:blip r:embed="rId9">
                       <a:extLst>
                         <a:ext uri="{28A0092B-C50C-407E-A947-70E740481C1C}">
                           <a14:useLocalDpi xmlns:a14="http://schemas.microsoft.com/office/drawing/2010/main"/>
@@ -344,7 +311,7 @@
                     </a:stretch>
                   </pic:blipFill>
                   <pic:spPr>
-                    <a:xfrm rot="0">
+                    <a:xfrm>
                       <a:off x="0" y="0"/>
                       <a:ext cx="3179663" cy="1059888"/>
                     </a:xfrm>
@@ -388,7 +355,7 @@
           <w:noProof/>
         </w:rPr>
         <w:pict w14:anchorId="7CF0E329">
-          <v:rect id="_x0000_i1027" style="width:468pt;height:.05pt;mso-width-percent:0;mso-height-percent:0;mso-width-percent:0;mso-height-percent:0" alt="" o:hr="t" o:hrstd="t" o:hralign="center" fillcolor="#a0a0a0" stroked="f"/>
+          <v:rect id="_x0000_i1027" alt="" style="width:468pt;height:.05pt;mso-width-percent:0;mso-height-percent:0;mso-width-percent:0;mso-height-percent:0" o:hralign="center" o:hrstd="t" o:hr="t" fillcolor="#a0a0a0" stroked="f"/>
         </w:pict>
       </w:r>
     </w:p>
@@ -404,6 +371,7 @@
         <w:rPr>
           <w:rFonts w:eastAsia="Times New Roman"/>
         </w:rPr>
+        <w:lastRenderedPageBreak/>
         <w:t>Style Guide</w:t>
       </w:r>
     </w:p>
@@ -427,12 +395,12 @@
         <w:tblW w:w="9308" w:type="dxa"/>
         <w:tblCellSpacing w:w="15" w:type="dxa"/>
         <w:tblBorders>
-          <w:top w:val="single" w:color="auto" w:sz="4" w:space="0"/>
-          <w:left w:val="single" w:color="auto" w:sz="4" w:space="0"/>
-          <w:bottom w:val="single" w:color="auto" w:sz="4" w:space="0"/>
-          <w:right w:val="single" w:color="auto" w:sz="4" w:space="0"/>
-          <w:insideH w:val="single" w:color="auto" w:sz="4" w:space="0"/>
-          <w:insideV w:val="single" w:color="auto" w:sz="4" w:space="0"/>
+          <w:top w:val="single" w:sz="4" w:space="0" w:color="auto"/>
+          <w:left w:val="single" w:sz="4" w:space="0" w:color="auto"/>
+          <w:bottom w:val="single" w:sz="4" w:space="0" w:color="auto"/>
+          <w:right w:val="single" w:sz="4" w:space="0" w:color="auto"/>
+          <w:insideH w:val="single" w:sz="4" w:space="0" w:color="auto"/>
+          <w:insideV w:val="single" w:sz="4" w:space="0" w:color="auto"/>
         </w:tblBorders>
         <w:tblCellMar>
           <w:top w:w="15" w:type="dxa"/>
@@ -457,7 +425,6 @@
           <w:tcPr>
             <w:tcW w:w="0" w:type="auto"/>
             <w:shd w:val="clear" w:color="auto" w:fill="A45642"/>
-            <w:tcMar/>
             <w:vAlign w:val="center"/>
             <w:hideMark/>
           </w:tcPr>
@@ -484,7 +451,6 @@
           <w:tcPr>
             <w:tcW w:w="0" w:type="auto"/>
             <w:shd w:val="clear" w:color="auto" w:fill="FBF2E7"/>
-            <w:tcMar/>
             <w:vAlign w:val="center"/>
             <w:hideMark/>
           </w:tcPr>
@@ -511,7 +477,6 @@
           <w:tcPr>
             <w:tcW w:w="0" w:type="auto"/>
             <w:shd w:val="clear" w:color="auto" w:fill="DEA64F"/>
-            <w:tcMar/>
             <w:vAlign w:val="center"/>
             <w:hideMark/>
           </w:tcPr>
@@ -538,7 +503,6 @@
           <w:tcPr>
             <w:tcW w:w="0" w:type="auto"/>
             <w:shd w:val="clear" w:color="auto" w:fill="443C34"/>
-            <w:tcMar/>
             <w:vAlign w:val="center"/>
             <w:hideMark/>
           </w:tcPr>
@@ -570,7 +534,6 @@
           <w:tcPr>
             <w:tcW w:w="0" w:type="auto"/>
             <w:shd w:val="clear" w:color="auto" w:fill="A45642"/>
-            <w:tcMar/>
             <w:vAlign w:val="center"/>
             <w:hideMark/>
           </w:tcPr>
@@ -593,7 +556,6 @@
           <w:tcPr>
             <w:tcW w:w="0" w:type="auto"/>
             <w:shd w:val="clear" w:color="auto" w:fill="FBF2E7"/>
-            <w:tcMar/>
             <w:vAlign w:val="center"/>
             <w:hideMark/>
           </w:tcPr>
@@ -628,7 +590,6 @@
           <w:tcPr>
             <w:tcW w:w="0" w:type="auto"/>
             <w:shd w:val="clear" w:color="auto" w:fill="DEA64F"/>
-            <w:tcMar/>
             <w:vAlign w:val="center"/>
             <w:hideMark/>
           </w:tcPr>
@@ -663,7 +624,6 @@
           <w:tcPr>
             <w:tcW w:w="0" w:type="auto"/>
             <w:shd w:val="clear" w:color="auto" w:fill="443C34"/>
-            <w:tcMar/>
             <w:vAlign w:val="center"/>
             <w:hideMark/>
           </w:tcPr>
@@ -700,10 +660,109 @@
       <w:pPr>
         <w:rPr>
           <w:rFonts w:eastAsia="Times New Roman"/>
+          <w:sz w:val="27"/>
+          <w:szCs w:val="27"/>
+        </w:rPr>
+      </w:pPr>
+      <w:r>
+        <w:rPr>
+          <w:rFonts w:eastAsia="Times New Roman"/>
+          <w:sz w:val="27"/>
+          <w:szCs w:val="27"/>
+        </w:rPr>
+        <w:t>Accent 2 seems good for text.</w:t>
+      </w:r>
+    </w:p>
+    <w:p>
+      <w:pPr>
+        <w:pStyle w:val="Heading3"/>
+        <w:jc w:val="center"/>
+        <w:rPr>
+          <w:rFonts w:eastAsia="Times New Roman"/>
+          <w:sz w:val="32"/>
+          <w:szCs w:val="32"/>
+        </w:rPr>
+      </w:pPr>
+      <w:r>
+        <w:rPr>
+          <w:rFonts w:eastAsia="Times New Roman"/>
+          <w:sz w:val="32"/>
+          <w:szCs w:val="32"/>
+        </w:rPr>
+        <w:t>Typography</w:t>
+      </w:r>
+      <w:r>
+        <w:rPr>
+          <w:rFonts w:eastAsia="Times New Roman"/>
+          <w:sz w:val="32"/>
+          <w:szCs w:val="32"/>
+        </w:rPr>
+        <w:t xml:space="preserve"> (links for html doc)</w:t>
+      </w:r>
+    </w:p>
+    <w:p>
+      <w:pPr>
+        <w:pStyle w:val="Heading4"/>
+        <w:jc w:val="center"/>
+        <w:rPr>
+          <w:rFonts w:eastAsia="Times New Roman"/>
+        </w:rPr>
+      </w:pPr>
+      <w:r>
+        <w:rPr>
+          <w:rFonts w:eastAsia="Times New Roman"/>
+        </w:rPr>
+        <w:t>Heading Font: [</w:t>
+      </w:r>
+      <w:r>
+        <w:rPr>
+          <w:rFonts w:eastAsia="Times New Roman"/>
+        </w:rPr>
+        <w:t>Jaro</w:t>
+      </w:r>
+      <w:r>
+        <w:rPr>
+          <w:rFonts w:eastAsia="Times New Roman"/>
+        </w:rPr>
+        <w:t>]</w:t>
+      </w:r>
+    </w:p>
+    <w:p>
+      <w:pPr>
+        <w:pStyle w:val="Heading4"/>
+        <w:spacing w:line="259" w:lineRule="auto"/>
+        <w:jc w:val="center"/>
+        <w:rPr>
+          <w:rFonts w:eastAsia="Times New Roman"/>
+        </w:rPr>
+      </w:pPr>
+      <w:r>
+        <w:rPr>
+          <w:rFonts w:eastAsia="Times New Roman"/>
+        </w:rPr>
+        <w:t xml:space="preserve">Paragraph Font: </w:t>
+      </w:r>
+      <w:r>
+        <w:rPr>
+          <w:rFonts w:eastAsia="Times New Roman"/>
+        </w:rPr>
+        <w:t>[Fira Sans</w:t>
+      </w:r>
+      <w:r>
+        <w:rPr>
+          <w:rFonts w:eastAsia="Times New Roman"/>
+        </w:rPr>
+        <w:t>]</w:t>
+      </w:r>
+    </w:p>
+    <w:p>
+      <w:pPr>
+        <w:pStyle w:val="Heading4"/>
+        <w:jc w:val="center"/>
+        <w:rPr>
+          <w:rFonts w:eastAsia="Times New Roman"/>
           <w:b w:val="0"/>
           <w:bCs w:val="0"/>
-          <w:sz w:val="27"/>
-          <w:szCs w:val="27"/>
         </w:rPr>
       </w:pPr>
       <w:r>
@@ -711,103 +770,28 @@
           <w:rFonts w:eastAsia="Times New Roman"/>
           <w:b w:val="0"/>
           <w:bCs w:val="0"/>
-          <w:sz w:val="27"/>
-          <w:szCs w:val="27"/>
-        </w:rPr>
-        <w:t>Accent 2 seems good for text.</w:t>
-      </w:r>
-    </w:p>
-    <w:p>
-      <w:pPr>
-        <w:pStyle w:val="Heading3"/>
-        <w:jc w:val="center"/>
-        <w:rPr>
-          <w:rFonts w:eastAsia="Times New Roman"/>
-          <w:sz w:val="32"/>
-          <w:szCs w:val="32"/>
-        </w:rPr>
-      </w:pPr>
-      <w:r>
-        <w:rPr>
-          <w:rFonts w:eastAsia="Times New Roman"/>
-          <w:sz w:val="32"/>
-          <w:szCs w:val="32"/>
-        </w:rPr>
-        <w:t>Typography</w:t>
-      </w:r>
-      <w:r>
-        <w:rPr>
-          <w:rFonts w:eastAsia="Times New Roman"/>
-          <w:sz w:val="32"/>
-          <w:szCs w:val="32"/>
-        </w:rPr>
-        <w:t xml:space="preserve"> (links for html doc)</w:t>
+        </w:rPr>
+        <w:t>&lt;link rel="preconnect" href="https://fonts.googleapis.com"&gt;</w:t>
       </w:r>
     </w:p>
     <w:p>
       <w:pPr>
         <w:pStyle w:val="Heading4"/>
         <w:jc w:val="center"/>
-        <w:rPr>
-          <w:rFonts w:eastAsia="Times New Roman"/>
-        </w:rPr>
-      </w:pPr>
-      <w:r>
-        <w:rPr>
-          <w:rFonts w:eastAsia="Times New Roman"/>
-        </w:rPr>
-        <w:t>Heading Font: [</w:t>
-      </w:r>
-      <w:r>
-        <w:rPr>
-          <w:rFonts w:eastAsia="Times New Roman"/>
-        </w:rPr>
-        <w:t>Jaro</w:t>
-      </w:r>
-      <w:r>
-        <w:rPr>
-          <w:rFonts w:eastAsia="Times New Roman"/>
-        </w:rPr>
-        <w:t>]</w:t>
-      </w:r>
-    </w:p>
-    <w:p>
-      <w:pPr>
-        <w:pStyle w:val="Heading4"/>
-        <w:spacing w:line="259" w:lineRule="auto"/>
-        <w:jc w:val="center"/>
-        <w:rPr>
-          <w:rFonts w:eastAsia="Times New Roman"/>
-        </w:rPr>
-      </w:pPr>
-      <w:r>
-        <w:rPr>
-          <w:rFonts w:eastAsia="Times New Roman"/>
-        </w:rPr>
-        <w:t xml:space="preserve">Paragraph Font: </w:t>
-      </w:r>
-      <w:r>
-        <w:rPr>
-          <w:rFonts w:eastAsia="Times New Roman"/>
-        </w:rPr>
-        <w:t>[Fira Sans</w:t>
-      </w:r>
-      <w:r>
-        <w:rPr>
-          <w:rFonts w:eastAsia="Times New Roman"/>
-        </w:rPr>
-        <w:t>]</w:t>
-      </w:r>
-    </w:p>
-    <w:p>
-      <w:pPr>
-        <w:pStyle w:val="Heading4"/>
-        <w:jc w:val="center"/>
+      </w:pPr>
+      <w:r>
         <w:rPr>
           <w:rFonts w:eastAsia="Times New Roman"/>
           <w:b w:val="0"/>
           <w:bCs w:val="0"/>
         </w:rPr>
+        <w:t>&lt;link rel="preconnect" href="https://fonts.gstatic.com" crossorigin&gt;</w:t>
+      </w:r>
+    </w:p>
+    <w:p>
+      <w:pPr>
+        <w:pStyle w:val="Heading4"/>
+        <w:jc w:val="center"/>
       </w:pPr>
       <w:r>
         <w:rPr>
@@ -815,27 +799,18 @@
           <w:b w:val="0"/>
           <w:bCs w:val="0"/>
         </w:rPr>
-        <w:t>&lt;link rel="preconnect" href="https://fonts.googleapis.com"&gt;</w:t>
+        <w:t>&lt;link href="https://fonts.googleapis.com/css2?family=Fira+Sans:ital,wght@0,100;0,200;0,300;0,400;0,500;0,600;0,700;0,800;0,900;1,100;1,200;1,300;1,400;1,500;1,600;1,700;1,800;1,900&amp;family=Jaro:opsz@6..72&amp;display=swap" rel="stylesheet"&gt;</w:t>
       </w:r>
     </w:p>
     <w:p>
       <w:pPr>
         <w:pStyle w:val="Heading4"/>
         <w:jc w:val="center"/>
-      </w:pPr>
-      <w:r>
         <w:rPr>
           <w:rFonts w:eastAsia="Times New Roman"/>
           <w:b w:val="0"/>
           <w:bCs w:val="0"/>
         </w:rPr>
-        <w:t>&lt;link rel="preconnect" href="https://fonts.gstatic.com" crossorigin&gt;</w:t>
-      </w:r>
-    </w:p>
-    <w:p>
-      <w:pPr>
-        <w:pStyle w:val="Heading4"/>
-        <w:jc w:val="center"/>
       </w:pPr>
       <w:r>
         <w:rPr>
@@ -843,73 +818,6 @@
           <w:b w:val="0"/>
           <w:bCs w:val="0"/>
         </w:rPr>
-        <w:t xml:space="preserve">&lt;link </w:t>
-      </w:r>
-      <w:r>
-        <w:rPr>
-          <w:rFonts w:eastAsia="Times New Roman"/>
-          <w:b w:val="0"/>
-          <w:bCs w:val="0"/>
-        </w:rPr>
-        <w:t>href</w:t>
-      </w:r>
-      <w:r>
-        <w:rPr>
-          <w:rFonts w:eastAsia="Times New Roman"/>
-          <w:b w:val="0"/>
-          <w:bCs w:val="0"/>
-        </w:rPr>
-        <w:t>="</w:t>
-      </w:r>
-      <w:r>
-        <w:rPr>
-          <w:rFonts w:eastAsia="Times New Roman"/>
-          <w:b w:val="0"/>
-          <w:bCs w:val="0"/>
-        </w:rPr>
-        <w:t>https://fonts.googleapis.com/css2?family=Fira+Sans:ital,wght@0,100;0,200;0,300;0,400;0,500;0,600;0,700;0,800;0,900;1,100;1,200;1,300;1,400;1,500;1,600;1,700;1,800;1,900&amp;family=Jaro:opsz@6..</w:t>
-      </w:r>
-      <w:r>
-        <w:rPr>
-          <w:rFonts w:eastAsia="Times New Roman"/>
-          <w:b w:val="0"/>
-          <w:bCs w:val="0"/>
-        </w:rPr>
-        <w:t xml:space="preserve">72&amp;display=swap" </w:t>
-      </w:r>
-      <w:r>
-        <w:rPr>
-          <w:rFonts w:eastAsia="Times New Roman"/>
-          <w:b w:val="0"/>
-          <w:bCs w:val="0"/>
-        </w:rPr>
-        <w:t>rel</w:t>
-      </w:r>
-      <w:r>
-        <w:rPr>
-          <w:rFonts w:eastAsia="Times New Roman"/>
-          <w:b w:val="0"/>
-          <w:bCs w:val="0"/>
-        </w:rPr>
-        <w:t>="stylesheet"&gt;</w:t>
-      </w:r>
-    </w:p>
-    <w:p>
-      <w:pPr>
-        <w:pStyle w:val="Heading4"/>
-        <w:jc w:val="center"/>
-        <w:rPr>
-          <w:rFonts w:eastAsia="Times New Roman"/>
-          <w:b w:val="0"/>
-          <w:bCs w:val="0"/>
-        </w:rPr>
-      </w:pPr>
-      <w:r>
-        <w:rPr>
-          <w:rFonts w:eastAsia="Times New Roman"/>
-          <w:b w:val="0"/>
-          <w:bCs w:val="0"/>
-        </w:rPr>
         <w:t>(these links are for the html)</w:t>
       </w:r>
     </w:p>
@@ -927,7 +835,7 @@
           <w:noProof/>
         </w:rPr>
         <w:pict w14:anchorId="5E8E6CE7">
-          <v:rect id="_x0000_i1028" style="width:468pt;height:.05pt;mso-width-percent:0;mso-height-percent:0;mso-width-percent:0;mso-height-percent:0" alt="" o:hr="t" o:hrstd="t" o:hralign="center" fillcolor="#a0a0a0" stroked="f"/>
+          <v:rect id="_x0000_i1028" alt="" style="width:468pt;height:.05pt;mso-width-percent:0;mso-height-percent:0;mso-width-percent:0;mso-height-percent:0" o:hralign="center" o:hrstd="t" o:hr="t" fillcolor="#a0a0a0" stroked="f"/>
         </w:pict>
       </w:r>
     </w:p>
@@ -1020,7 +928,7 @@
           <w:noProof/>
         </w:rPr>
         <w:pict w14:anchorId="167B79FD">
-          <v:rect id="_x0000_i1029" style="width:468pt;height:.05pt;mso-width-percent:0;mso-height-percent:0;mso-width-percent:0;mso-height-percent:0" alt="" o:hr="t" o:hrstd="t" o:hralign="center" fillcolor="#a0a0a0" stroked="f"/>
+          <v:rect id="_x0000_i1029" alt="" style="width:468pt;height:.05pt;mso-width-percent:0;mso-height-percent:0;mso-width-percent:0;mso-height-percent:0" o:hralign="center" o:hrstd="t" o:hr="t" fillcolor="#a0a0a0" stroked="f"/>
         </w:pict>
       </w:r>
     </w:p>
@@ -1172,7 +1080,89 @@
         <w:rPr>
           <w:rFonts w:eastAsia="Times New Roman"/>
         </w:rPr>
-        <w:t>avourite</w:t>
+        <w:t xml:space="preserve">avourite </w:t>
+      </w:r>
+      <w:r>
+        <w:rPr>
+          <w:rFonts w:eastAsia="Times New Roman"/>
+        </w:rPr>
+        <w:t>A</w:t>
+      </w:r>
+      <w:r>
+        <w:rPr>
+          <w:rFonts w:eastAsia="Times New Roman"/>
+        </w:rPr>
+        <w:t xml:space="preserve">nime website! If you are sick of the </w:t>
+      </w:r>
+      <w:r>
+        <w:rPr>
+          <w:rFonts w:eastAsia="Times New Roman"/>
+        </w:rPr>
+        <w:t xml:space="preserve">same-old battle shounen action formula and want to explore other genres </w:t>
+      </w:r>
+      <w:r>
+        <w:rPr>
+          <w:rFonts w:eastAsia="Times New Roman"/>
+        </w:rPr>
+        <w:t xml:space="preserve">of anime </w:t>
+      </w:r>
+      <w:r>
+        <w:rPr>
+          <w:rFonts w:eastAsia="Times New Roman"/>
+        </w:rPr>
+        <w:t xml:space="preserve">but don’t know where to start, this </w:t>
+      </w:r>
+      <w:r>
+        <w:rPr>
+          <w:rFonts w:eastAsia="Times New Roman"/>
+        </w:rPr>
+        <w:t>place</w:t>
+      </w:r>
+      <w:r>
+        <w:rPr>
+          <w:rFonts w:eastAsia="Times New Roman"/>
+        </w:rPr>
+        <w:t xml:space="preserve"> is for you! </w:t>
+      </w:r>
+      <w:r>
+        <w:rPr>
+          <w:rFonts w:eastAsia="Times New Roman"/>
+        </w:rPr>
+        <w:t>Browse a limited selection of shows &amp; comics, and find for yourse</w:t>
+      </w:r>
+      <w:r>
+        <w:rPr>
+          <w:rFonts w:eastAsia="Times New Roman"/>
+        </w:rPr>
+        <w:t>lf a new series to binge in your free time!</w:t>
+      </w:r>
+    </w:p>
+    <w:p>
+      <w:pPr>
+        <w:spacing w:line="259" w:lineRule="auto"/>
+        <w:jc w:val="center"/>
+        <w:rPr>
+          <w:rFonts w:eastAsia="Times New Roman"/>
+        </w:rPr>
+      </w:pPr>
+      <w:r>
+        <w:rPr>
+          <w:rFonts w:eastAsia="Times New Roman"/>
+        </w:rPr>
+        <w:lastRenderedPageBreak/>
+        <w:t>“</w:t>
+      </w:r>
+      <w:r>
+        <w:rPr>
+          <w:rFonts w:eastAsia="Times New Roman"/>
+        </w:rPr>
+        <w:t>What is Anime?</w:t>
+      </w:r>
+      <w:r>
+        <w:rPr>
+          <w:rFonts w:eastAsia="Times New Roman"/>
+        </w:rPr>
+        <w:t>”:</w:t>
       </w:r>
       <w:r>
         <w:rPr>
@@ -1184,91 +1174,61 @@
         <w:rPr>
           <w:rFonts w:eastAsia="Times New Roman"/>
         </w:rPr>
-        <w:t>A</w:t>
-      </w:r>
-      <w:r>
-        <w:rPr>
-          <w:rFonts w:eastAsia="Times New Roman"/>
-        </w:rPr>
-        <w:t xml:space="preserve">nime website! If you are sick of the </w:t>
-      </w:r>
-      <w:r>
-        <w:rPr>
-          <w:rFonts w:eastAsia="Times New Roman"/>
-        </w:rPr>
-        <w:t xml:space="preserve">same-old battle shounen action formula and want to explore other genres </w:t>
-      </w:r>
-      <w:r>
-        <w:rPr>
-          <w:rFonts w:eastAsia="Times New Roman"/>
-        </w:rPr>
-        <w:t xml:space="preserve">of anime </w:t>
-      </w:r>
-      <w:r>
-        <w:rPr>
-          <w:rFonts w:eastAsia="Times New Roman"/>
-        </w:rPr>
-        <w:t xml:space="preserve">but </w:t>
-      </w:r>
-      <w:r>
-        <w:rPr>
-          <w:rFonts w:eastAsia="Times New Roman"/>
-        </w:rPr>
-        <w:t>don’t</w:t>
-      </w:r>
-      <w:r>
-        <w:rPr>
-          <w:rFonts w:eastAsia="Times New Roman"/>
-        </w:rPr>
-        <w:t xml:space="preserve"> know where to start, this </w:t>
-      </w:r>
-      <w:r>
-        <w:rPr>
-          <w:rFonts w:eastAsia="Times New Roman"/>
-        </w:rPr>
-        <w:t>place</w:t>
-      </w:r>
-      <w:r>
-        <w:rPr>
-          <w:rFonts w:eastAsia="Times New Roman"/>
-        </w:rPr>
-        <w:t xml:space="preserve"> is for you! </w:t>
-      </w:r>
-      <w:r>
-        <w:rPr>
-          <w:rFonts w:eastAsia="Times New Roman"/>
-        </w:rPr>
-        <w:t xml:space="preserve">Browse a limited </w:t>
-      </w:r>
-      <w:r>
-        <w:rPr>
-          <w:rFonts w:eastAsia="Times New Roman"/>
-        </w:rPr>
-        <w:t>selection</w:t>
-      </w:r>
-      <w:r>
-        <w:rPr>
-          <w:rFonts w:eastAsia="Times New Roman"/>
-        </w:rPr>
-        <w:t xml:space="preserve"> of shows &amp; </w:t>
-      </w:r>
-      <w:r>
-        <w:rPr>
-          <w:rFonts w:eastAsia="Times New Roman"/>
-        </w:rPr>
-        <w:t>comics, and</w:t>
-      </w:r>
-      <w:r>
-        <w:rPr>
-          <w:rFonts w:eastAsia="Times New Roman"/>
-        </w:rPr>
-        <w:t xml:space="preserve"> find for yourse</w:t>
-      </w:r>
-      <w:r>
-        <w:rPr>
-          <w:rFonts w:eastAsia="Times New Roman"/>
-        </w:rPr>
-        <w:t>lf a new series to binge in your free time!</w:t>
+        <w:t>Literally speaking, t</w:t>
+      </w:r>
+      <w:r>
+        <w:rPr>
+          <w:rFonts w:eastAsia="Times New Roman"/>
+        </w:rPr>
+        <w:t>he term “</w:t>
+      </w:r>
+      <w:r>
+        <w:rPr>
+          <w:rFonts w:eastAsia="Times New Roman"/>
+        </w:rPr>
+        <w:t>a</w:t>
+      </w:r>
+      <w:r>
+        <w:rPr>
+          <w:rFonts w:eastAsia="Times New Roman"/>
+        </w:rPr>
+        <w:t>nime” refers to</w:t>
+      </w:r>
+      <w:r>
+        <w:rPr>
+          <w:rFonts w:eastAsia="Times New Roman"/>
+        </w:rPr>
+        <w:t xml:space="preserve"> </w:t>
+      </w:r>
+      <w:r>
+        <w:rPr>
+          <w:rFonts w:eastAsia="Times New Roman"/>
+        </w:rPr>
+        <w:t>any work of animation.</w:t>
+      </w:r>
+      <w:r>
+        <w:rPr>
+          <w:rFonts w:eastAsia="Times New Roman"/>
+        </w:rPr>
+        <w:t xml:space="preserve"> Though in the lingo of </w:t>
+      </w:r>
+      <w:r>
+        <w:rPr>
+          <w:rFonts w:eastAsia="Times New Roman"/>
+        </w:rPr>
+        <w:t>American watchers</w:t>
+      </w:r>
+      <w:r>
+        <w:rPr>
+          <w:rFonts w:eastAsia="Times New Roman"/>
+        </w:rPr>
+        <w:t>, it specifically refers to any work of animation within Japan.</w:t>
+      </w:r>
+      <w:r>
+        <w:rPr>
+          <w:rFonts w:eastAsia="Times New Roman"/>
+        </w:rPr>
+        <w:t xml:space="preserve"> Anime are usually, though not always, adaptations of japanese comics called “manga.”</w:t>
       </w:r>
     </w:p>
     <w:p>
@@ -1295,19 +1255,225 @@
         <w:rPr>
           <w:rFonts w:eastAsia="Times New Roman"/>
         </w:rPr>
+        <w:t>Misc</w:t>
+      </w:r>
+      <w:r>
+        <w:rPr>
+          <w:rFonts w:eastAsia="Times New Roman"/>
+        </w:rPr>
+        <w:t>?</w:t>
+      </w:r>
+      <w:r>
+        <w:rPr>
+          <w:rFonts w:eastAsia="Times New Roman"/>
+        </w:rPr>
+        <w:t>”:</w:t>
+      </w:r>
+      <w:r>
+        <w:rPr>
+          <w:rFonts w:eastAsia="Times New Roman"/>
+        </w:rPr>
+        <w:t xml:space="preserve"> </w:t>
+      </w:r>
+      <w:r>
+        <w:rPr>
+          <w:rFonts w:eastAsia="Times New Roman"/>
+        </w:rPr>
+        <w:t>Shortened from the word miscellaneous, t</w:t>
+      </w:r>
+      <w:r>
+        <w:rPr>
+          <w:rFonts w:eastAsia="Times New Roman"/>
+        </w:rPr>
+        <w:t>he “</w:t>
+      </w:r>
+      <w:r>
+        <w:rPr>
+          <w:rFonts w:eastAsia="Times New Roman"/>
+        </w:rPr>
+        <w:t>misc</w:t>
+      </w:r>
+      <w:r>
+        <w:rPr>
+          <w:rFonts w:eastAsia="Times New Roman"/>
+        </w:rPr>
+        <w:t xml:space="preserve">” page of this website is </w:t>
+      </w:r>
+      <w:r>
+        <w:rPr>
+          <w:rFonts w:eastAsia="Times New Roman"/>
+        </w:rPr>
+        <w:t>consisting</w:t>
+      </w:r>
+      <w:r>
+        <w:rPr>
+          <w:rFonts w:eastAsia="Times New Roman"/>
+        </w:rPr>
+        <w:t xml:space="preserve"> of</w:t>
+      </w:r>
+      <w:r>
+        <w:rPr>
+          <w:rFonts w:eastAsia="Times New Roman"/>
+        </w:rPr>
+        <w:t xml:space="preserve"> recommendations of</w:t>
+      </w:r>
+      <w:r>
+        <w:rPr>
+          <w:rFonts w:eastAsia="Times New Roman"/>
+        </w:rPr>
+        <w:t xml:space="preserve"> show</w:t>
+      </w:r>
+      <w:r>
+        <w:rPr>
+          <w:rFonts w:eastAsia="Times New Roman"/>
+        </w:rPr>
+        <w:t>s</w:t>
+      </w:r>
+      <w:r>
+        <w:rPr>
+          <w:rFonts w:eastAsia="Times New Roman"/>
+        </w:rPr>
+        <w:t xml:space="preserve"> or series that aren’t strictly anime, whether they be comics, cartoons</w:t>
+      </w:r>
+      <w:r>
+        <w:rPr>
+          <w:rFonts w:eastAsia="Times New Roman"/>
+        </w:rPr>
+        <w:t xml:space="preserve"> or books</w:t>
+      </w:r>
+      <w:r>
+        <w:rPr>
+          <w:rFonts w:eastAsia="Times New Roman"/>
+        </w:rPr>
+        <w:t>.</w:t>
+      </w:r>
+    </w:p>
+    <w:p>
+      <w:pPr>
+        <w:jc w:val="center"/>
+        <w:rPr>
+          <w:rFonts w:eastAsia="Times New Roman"/>
+        </w:rPr>
+      </w:pPr>
+    </w:p>
+    <w:p>
+      <w:pPr>
+        <w:jc w:val="center"/>
+        <w:rPr>
+          <w:rFonts w:eastAsia="Times New Roman"/>
+        </w:rPr>
+      </w:pPr>
+      <w:r>
+        <w:rPr>
+          <w:rFonts w:eastAsia="Times New Roman"/>
+        </w:rPr>
+        <w:t xml:space="preserve">[ </w:t>
+      </w:r>
+      <w:r>
+        <w:rPr>
+          <w:rFonts w:eastAsia="Times New Roman"/>
+        </w:rPr>
         <w:t>Anime</w:t>
       </w:r>
       <w:r>
         <w:rPr>
           <w:rFonts w:eastAsia="Times New Roman"/>
         </w:rPr>
-        <w:t>?</w:t>
-      </w:r>
-      <w:r>
-        <w:rPr>
-          <w:rFonts w:eastAsia="Times New Roman"/>
-        </w:rPr>
-        <w:t>”:</w:t>
+        <w:t xml:space="preserve"> Page</w:t>
+      </w:r>
+      <w:r>
+        <w:rPr>
+          <w:rFonts w:eastAsia="Times New Roman"/>
+        </w:rPr>
+        <w:t>:</w:t>
+      </w:r>
+      <w:r>
+        <w:rPr>
+          <w:rFonts w:eastAsia="Times New Roman"/>
+        </w:rPr>
+        <w:t xml:space="preserve"> ]</w:t>
+      </w:r>
+    </w:p>
+    <w:p>
+      <w:pPr>
+        <w:spacing w:line="259" w:lineRule="auto"/>
+        <w:jc w:val="center"/>
+        <w:rPr>
+          <w:rFonts w:eastAsia="Times New Roman"/>
+        </w:rPr>
+      </w:pPr>
+      <w:r>
+        <w:rPr>
+          <w:rFonts w:eastAsia="Times New Roman"/>
+        </w:rPr>
+        <w:t>[</w:t>
+      </w:r>
+      <w:r>
+        <w:rPr>
+          <w:rFonts w:eastAsia="Times New Roman"/>
+          <w:u w:val="single"/>
+        </w:rPr>
+        <w:t>About</w:t>
+      </w:r>
+      <w:r>
+        <w:rPr>
+          <w:rFonts w:eastAsia="Times New Roman"/>
+        </w:rPr>
+        <w:t xml:space="preserve">] </w:t>
+      </w:r>
+      <w:r>
+        <w:rPr>
+          <w:rFonts w:eastAsia="Times New Roman"/>
+        </w:rPr>
+        <w:t>“What is this?”</w:t>
+      </w:r>
+      <w:r>
+        <w:rPr>
+          <w:rFonts w:eastAsia="Times New Roman"/>
+        </w:rPr>
+        <w:t xml:space="preserve">: </w:t>
+      </w:r>
+      <w:r>
+        <w:rPr>
+          <w:rFonts w:eastAsia="Times New Roman"/>
+        </w:rPr>
+        <w:t>This is my page focused solely on my anime recommendations!</w:t>
+      </w:r>
+      <w:r>
+        <w:rPr>
+          <w:rFonts w:eastAsia="Times New Roman"/>
+        </w:rPr>
+        <w:t xml:space="preserve"> Literally speaking, the term “anime” refers to any work of animation. Though in the lingo of American watchers, it specifically refers to any work of animation within Japan. Anime are usually, though not always, adaptations of Japanese comics called “manga.”</w:t>
+      </w:r>
+    </w:p>
+    <w:p>
+      <w:pPr>
+        <w:jc w:val="center"/>
+        <w:rPr>
+          <w:rFonts w:eastAsia="Times New Roman"/>
+        </w:rPr>
+      </w:pPr>
+    </w:p>
+    <w:p>
+      <w:pPr>
+        <w:spacing w:line="259" w:lineRule="auto"/>
+        <w:jc w:val="center"/>
+        <w:rPr>
+          <w:rFonts w:eastAsia="Times New Roman"/>
+        </w:rPr>
+      </w:pPr>
+      <w:r>
+        <w:rPr>
+          <w:rFonts w:eastAsia="Times New Roman"/>
+          <w:u w:val="single"/>
+        </w:rPr>
+        <w:t>Frieren: Beyond Journey’s End</w:t>
+      </w:r>
+      <w:r>
+        <w:rPr>
+          <w:rFonts w:eastAsia="Times New Roman"/>
+        </w:rPr>
+        <w:t xml:space="preserve"> (2023):</w:t>
       </w:r>
       <w:r>
         <w:rPr>
@@ -1319,25 +1485,67 @@
         <w:rPr>
           <w:rFonts w:eastAsia="Times New Roman"/>
         </w:rPr>
-        <w:t>Literally speaking, t</w:t>
-      </w:r>
-      <w:r>
-        <w:rPr>
-          <w:rFonts w:eastAsia="Times New Roman"/>
-        </w:rPr>
-        <w:t>he term “</w:t>
-      </w:r>
-      <w:r>
-        <w:rPr>
-          <w:rFonts w:eastAsia="Times New Roman"/>
-        </w:rPr>
-        <w:t>a</w:t>
-      </w:r>
-      <w:r>
-        <w:rPr>
-          <w:rFonts w:eastAsia="Times New Roman"/>
-        </w:rPr>
-        <w:t>nime” refers to</w:t>
+        <w:t>Currently airing with two seasons, t</w:t>
+      </w:r>
+      <w:r>
+        <w:rPr>
+          <w:rFonts w:eastAsia="Times New Roman"/>
+        </w:rPr>
+        <w:t>his anime is the current gold-standard for how great anime can be.</w:t>
+      </w:r>
+      <w:r>
+        <w:rPr>
+          <w:rFonts w:eastAsia="Times New Roman"/>
+        </w:rPr>
+        <w:t xml:space="preserve"> This series is about the titular </w:t>
+      </w:r>
+      <w:r>
+        <w:rPr>
+          <w:rFonts w:eastAsia="Times New Roman"/>
+        </w:rPr>
+        <w:t xml:space="preserve">immortal </w:t>
+      </w:r>
+      <w:r>
+        <w:rPr>
+          <w:rFonts w:eastAsia="Times New Roman"/>
+        </w:rPr>
+        <w:t>elf Frieren</w:t>
+      </w:r>
+      <w:r>
+        <w:rPr>
+          <w:rFonts w:eastAsia="Times New Roman"/>
+        </w:rPr>
+        <w:t>, a former member of “The Hero’s Party,” who had vanquished the Demon King and his army 80 years prior to the events of the story</w:t>
+      </w:r>
+      <w:r>
+        <w:rPr>
+          <w:rFonts w:eastAsia="Times New Roman"/>
+        </w:rPr>
+        <w:t>. A</w:t>
+      </w:r>
+      <w:r>
+        <w:rPr>
+          <w:rFonts w:eastAsia="Times New Roman"/>
+        </w:rPr>
+        <w:t xml:space="preserve">fter the death of the beloved hero Himmel, </w:t>
+      </w:r>
+      <w:r>
+        <w:rPr>
+          <w:rFonts w:eastAsia="Times New Roman"/>
+        </w:rPr>
+        <w:t xml:space="preserve">Frieren </w:t>
+      </w:r>
+      <w:r>
+        <w:rPr>
+          <w:rFonts w:eastAsia="Times New Roman"/>
+        </w:rPr>
+        <w:t>sets on a journey</w:t>
+      </w:r>
+      <w:r>
+        <w:rPr>
+          <w:rFonts w:eastAsia="Times New Roman"/>
+        </w:rPr>
+        <w:t xml:space="preserve"> to the land of the dead</w:t>
       </w:r>
       <w:r>
         <w:rPr>
@@ -1349,55 +1557,87 @@
         <w:rPr>
           <w:rFonts w:eastAsia="Times New Roman"/>
         </w:rPr>
-        <w:t>any work of animation.</w:t>
-      </w:r>
-      <w:r>
-        <w:rPr>
-          <w:rFonts w:eastAsia="Times New Roman"/>
-        </w:rPr>
-        <w:t xml:space="preserve"> Though in the lingo of </w:t>
-      </w:r>
-      <w:r>
-        <w:rPr>
-          <w:rFonts w:eastAsia="Times New Roman"/>
-        </w:rPr>
-        <w:t>American watchers</w:t>
-      </w:r>
-      <w:r>
-        <w:rPr>
-          <w:rFonts w:eastAsia="Times New Roman"/>
-        </w:rPr>
-        <w:t>, it specifically refers to any work of animation within Japan.</w:t>
-      </w:r>
-      <w:r>
-        <w:rPr>
-          <w:rFonts w:eastAsia="Times New Roman"/>
-        </w:rPr>
-        <w:t xml:space="preserve"> Anime </w:t>
-      </w:r>
-      <w:r>
-        <w:rPr>
-          <w:rFonts w:eastAsia="Times New Roman"/>
-        </w:rPr>
-        <w:t>are</w:t>
-      </w:r>
-      <w:r>
-        <w:rPr>
-          <w:rFonts w:eastAsia="Times New Roman"/>
-        </w:rPr>
-        <w:t xml:space="preserve"> usually, though not always, adaptations of </w:t>
-      </w:r>
-      <w:r>
-        <w:rPr>
-          <w:rFonts w:eastAsia="Times New Roman"/>
-        </w:rPr>
-        <w:t>japanese</w:t>
-      </w:r>
-      <w:r>
-        <w:rPr>
-          <w:rFonts w:eastAsia="Times New Roman"/>
-        </w:rPr>
-        <w:t xml:space="preserve"> comics called “manga.”</w:t>
+        <w:t xml:space="preserve">along with the </w:t>
+      </w:r>
+      <w:r>
+        <w:rPr>
+          <w:rFonts w:eastAsia="Times New Roman"/>
+        </w:rPr>
+        <w:t xml:space="preserve">current </w:t>
+      </w:r>
+      <w:r>
+        <w:rPr>
+          <w:rFonts w:eastAsia="Times New Roman"/>
+        </w:rPr>
+        <w:t>disciples of her former party-members.</w:t>
+      </w:r>
+      <w:r>
+        <w:rPr>
+          <w:rFonts w:eastAsia="Times New Roman"/>
+        </w:rPr>
+        <w:t xml:space="preserve"> </w:t>
+      </w:r>
+      <w:r>
+        <w:rPr>
+          <w:rFonts w:eastAsia="Times New Roman"/>
+        </w:rPr>
+        <w:t>Both dubbed and subtitled in English, this series is a slow-burn</w:t>
+      </w:r>
+      <w:r>
+        <w:rPr>
+          <w:rFonts w:eastAsia="Times New Roman"/>
+        </w:rPr>
+        <w:t>, cozy</w:t>
+      </w:r>
+      <w:r>
+        <w:rPr>
+          <w:rFonts w:eastAsia="Times New Roman"/>
+        </w:rPr>
+        <w:t xml:space="preserve"> fantasy anime about living in the moment and appreciating the small things in life.</w:t>
+      </w:r>
+      <w:r>
+        <w:rPr>
+          <w:rFonts w:eastAsia="Times New Roman"/>
+        </w:rPr>
+        <w:t xml:space="preserve"> </w:t>
+      </w:r>
+      <w:r>
+        <w:rPr>
+          <w:rFonts w:eastAsia="Times New Roman"/>
+        </w:rPr>
+        <w:t>Coupled with good writing and excellent animation, Frieren: Beyond Journey’s End is a great place to start watching anime.</w:t>
+      </w:r>
+      <w:r>
+        <w:rPr>
+          <w:rFonts w:eastAsia="Times New Roman"/>
+        </w:rPr>
+        <w:t xml:space="preserve"> </w:t>
+      </w:r>
+      <w:r>
+        <w:rPr>
+          <w:rFonts w:eastAsia="Times New Roman"/>
+        </w:rPr>
+        <w:t>This anime is adapted from a manga of the same name, which has been in hiatus since October 2025.</w:t>
+      </w:r>
+    </w:p>
+    <w:p>
+      <w:pPr>
+        <w:jc w:val="center"/>
+        <w:rPr>
+          <w:rFonts w:eastAsia="Times New Roman"/>
+        </w:rPr>
+      </w:pPr>
+      <w:r>
+        <w:rPr>
+          <w:rFonts w:eastAsia="Times New Roman"/>
+        </w:rPr>
+        <w:t>Genre: fantasy, magic, adventure</w:t>
+      </w:r>
+      <w:r>
+        <w:rPr>
+          <w:rFonts w:eastAsia="Times New Roman"/>
+        </w:rPr>
+        <w:t>, slice-of-life, drama, slow-pace</w:t>
       </w:r>
     </w:p>
     <w:p>
@@ -1410,557 +1650,25 @@
       </w:pPr>
       <w:r>
         <w:rPr>
-          <w:rFonts w:eastAsia="Times New Roman"/>
-        </w:rPr>
-        <w:t>“</w:t>
-      </w:r>
-      <w:r>
-        <w:rPr>
-          <w:rFonts w:eastAsia="Times New Roman"/>
-        </w:rPr>
-        <w:t xml:space="preserve">What is </w:t>
-      </w:r>
-      <w:r>
-        <w:rPr>
-          <w:rFonts w:eastAsia="Times New Roman"/>
-        </w:rPr>
-        <w:t>Misc</w:t>
-      </w:r>
-      <w:r>
-        <w:rPr>
-          <w:rFonts w:eastAsia="Times New Roman"/>
-        </w:rPr>
-        <w:t>?</w:t>
-      </w:r>
-      <w:r>
-        <w:rPr>
-          <w:rFonts w:eastAsia="Times New Roman"/>
-        </w:rPr>
-        <w:t>”:</w:t>
-      </w:r>
-      <w:r>
-        <w:rPr>
-          <w:rFonts w:eastAsia="Times New Roman"/>
-        </w:rPr>
-        <w:t xml:space="preserve"> </w:t>
-      </w:r>
-      <w:r>
-        <w:rPr>
-          <w:rFonts w:eastAsia="Times New Roman"/>
-        </w:rPr>
-        <w:t>Shortened from the word miscellaneous, t</w:t>
-      </w:r>
-      <w:r>
-        <w:rPr>
-          <w:rFonts w:eastAsia="Times New Roman"/>
-        </w:rPr>
-        <w:t>he “</w:t>
-      </w:r>
-      <w:r>
-        <w:rPr>
-          <w:rFonts w:eastAsia="Times New Roman"/>
-        </w:rPr>
-        <w:t>misc</w:t>
-      </w:r>
-      <w:r>
-        <w:rPr>
-          <w:rFonts w:eastAsia="Times New Roman"/>
-        </w:rPr>
-        <w:t xml:space="preserve">” page of this website </w:t>
-      </w:r>
-      <w:r>
-        <w:rPr>
-          <w:rFonts w:eastAsia="Times New Roman"/>
-        </w:rPr>
-        <w:t xml:space="preserve">is </w:t>
-      </w:r>
-      <w:r>
-        <w:rPr>
-          <w:rFonts w:eastAsia="Times New Roman"/>
-        </w:rPr>
-        <w:t>consisting</w:t>
-      </w:r>
-      <w:r>
-        <w:rPr>
-          <w:rFonts w:eastAsia="Times New Roman"/>
-        </w:rPr>
-        <w:t xml:space="preserve"> of</w:t>
-      </w:r>
-      <w:r>
-        <w:rPr>
-          <w:rFonts w:eastAsia="Times New Roman"/>
-        </w:rPr>
-        <w:t xml:space="preserve"> recommendations of</w:t>
-      </w:r>
-      <w:r>
-        <w:rPr>
-          <w:rFonts w:eastAsia="Times New Roman"/>
-        </w:rPr>
-        <w:t xml:space="preserve"> show</w:t>
-      </w:r>
-      <w:r>
-        <w:rPr>
-          <w:rFonts w:eastAsia="Times New Roman"/>
-        </w:rPr>
-        <w:t>s</w:t>
-      </w:r>
-      <w:r>
-        <w:rPr>
-          <w:rFonts w:eastAsia="Times New Roman"/>
-        </w:rPr>
-        <w:t xml:space="preserve"> or series that </w:t>
-      </w:r>
-      <w:r>
-        <w:rPr>
-          <w:rFonts w:eastAsia="Times New Roman"/>
-        </w:rPr>
-        <w:t>aren’t</w:t>
-      </w:r>
-      <w:r>
-        <w:rPr>
-          <w:rFonts w:eastAsia="Times New Roman"/>
-        </w:rPr>
-        <w:t xml:space="preserve"> strictly anime, whether they be comics, </w:t>
-      </w:r>
-      <w:r>
-        <w:rPr>
-          <w:rFonts w:eastAsia="Times New Roman"/>
-        </w:rPr>
-        <w:t>cartoons</w:t>
-      </w:r>
-      <w:r>
-        <w:rPr>
-          <w:rFonts w:eastAsia="Times New Roman"/>
-        </w:rPr>
-        <w:t xml:space="preserve"> or books</w:t>
-      </w:r>
-      <w:r>
-        <w:rPr>
-          <w:rFonts w:eastAsia="Times New Roman"/>
-        </w:rPr>
-        <w:t>.</w:t>
-      </w:r>
-    </w:p>
-    <w:p>
-      <w:pPr>
-        <w:jc w:val="center"/>
-        <w:rPr>
-          <w:rFonts w:eastAsia="Times New Roman"/>
-        </w:rPr>
-      </w:pPr>
-    </w:p>
-    <w:p>
-      <w:pPr>
-        <w:jc w:val="center"/>
-        <w:rPr>
-          <w:rFonts w:eastAsia="Times New Roman"/>
-        </w:rPr>
-      </w:pPr>
-      <w:r>
-        <w:rPr>
-          <w:rFonts w:eastAsia="Times New Roman"/>
-        </w:rPr>
-        <w:t xml:space="preserve">[ </w:t>
-      </w:r>
-      <w:r>
-        <w:rPr>
-          <w:rFonts w:eastAsia="Times New Roman"/>
-        </w:rPr>
-        <w:t>Anime</w:t>
-      </w:r>
-      <w:r>
-        <w:rPr>
-          <w:rFonts w:eastAsia="Times New Roman"/>
-        </w:rPr>
-        <w:t xml:space="preserve"> Page</w:t>
-      </w:r>
-      <w:r>
-        <w:rPr>
-          <w:rFonts w:eastAsia="Times New Roman"/>
-        </w:rPr>
-        <w:t>:</w:t>
-      </w:r>
-      <w:r>
-        <w:rPr>
-          <w:rFonts w:eastAsia="Times New Roman"/>
-        </w:rPr>
-        <w:t xml:space="preserve"> ]</w:t>
-      </w:r>
-    </w:p>
-    <w:p>
-      <w:pPr>
-        <w:spacing w:line="259" w:lineRule="auto"/>
-        <w:jc w:val="center"/>
-        <w:rPr>
-          <w:rFonts w:eastAsia="Times New Roman"/>
-        </w:rPr>
-      </w:pPr>
-      <w:r>
-        <w:rPr>
-          <w:rFonts w:eastAsia="Times New Roman"/>
-          <w:u w:val="none"/>
-        </w:rPr>
-        <w:t>[</w:t>
-      </w:r>
-      <w:r>
-        <w:rPr>
-          <w:rFonts w:eastAsia="Times New Roman"/>
-          <w:u w:val="single"/>
-        </w:rPr>
-        <w:t>About</w:t>
-      </w:r>
-      <w:r>
-        <w:rPr>
-          <w:rFonts w:eastAsia="Times New Roman"/>
-          <w:u w:val="none"/>
-        </w:rPr>
-        <w:t xml:space="preserve">] </w:t>
-      </w:r>
-      <w:r>
-        <w:rPr>
-          <w:rFonts w:eastAsia="Times New Roman"/>
-          <w:u w:val="none"/>
-        </w:rPr>
-        <w:t>“What is this?”</w:t>
-      </w:r>
-      <w:r>
-        <w:rPr>
-          <w:rFonts w:eastAsia="Times New Roman"/>
-          <w:u w:val="none"/>
-        </w:rPr>
-        <w:t xml:space="preserve">: </w:t>
-      </w:r>
-      <w:r>
-        <w:rPr>
-          <w:rFonts w:eastAsia="Times New Roman"/>
-          <w:u w:val="none"/>
-        </w:rPr>
-        <w:t>This is my page focused solely on my anime recommendations!</w:t>
-      </w:r>
-      <w:r>
-        <w:rPr>
-          <w:rFonts w:eastAsia="Times New Roman"/>
-          <w:u w:val="none"/>
-        </w:rPr>
-        <w:t xml:space="preserve"> Literally speaking, the term “anime” refers to any work of animation. Though in the lingo of American watchers, it specifically refers to any work of animation within Japan. Anime </w:t>
-      </w:r>
-      <w:r>
-        <w:rPr>
-          <w:rFonts w:eastAsia="Times New Roman"/>
-          <w:u w:val="none"/>
-        </w:rPr>
-        <w:t>are</w:t>
-      </w:r>
-      <w:r>
-        <w:rPr>
-          <w:rFonts w:eastAsia="Times New Roman"/>
-          <w:u w:val="none"/>
-        </w:rPr>
-        <w:t xml:space="preserve"> usually, though not always, adaptations of </w:t>
-      </w:r>
-      <w:r>
-        <w:rPr>
-          <w:rFonts w:eastAsia="Times New Roman"/>
-          <w:u w:val="none"/>
-        </w:rPr>
-        <w:t>Japanese</w:t>
-      </w:r>
-      <w:r>
-        <w:rPr>
-          <w:rFonts w:eastAsia="Times New Roman"/>
-          <w:u w:val="none"/>
-        </w:rPr>
-        <w:t xml:space="preserve"> comics called “manga.”</w:t>
-      </w:r>
-    </w:p>
-    <w:p>
-      <w:pPr>
-        <w:jc w:val="center"/>
-        <w:rPr>
-          <w:rFonts w:eastAsia="Times New Roman"/>
-          <w:u w:val="none"/>
-        </w:rPr>
-      </w:pPr>
-    </w:p>
-    <w:p>
-      <w:pPr>
-        <w:spacing w:line="259" w:lineRule="auto"/>
-        <w:jc w:val="center"/>
-        <w:rPr>
-          <w:rFonts w:eastAsia="Times New Roman"/>
-        </w:rPr>
-      </w:pPr>
-      <w:r>
-        <w:rPr>
-          <w:rFonts w:eastAsia="Times New Roman"/>
-          <w:u w:val="single"/>
-        </w:rPr>
-        <w:t>Frieren</w:t>
-      </w:r>
-      <w:r>
-        <w:rPr>
-          <w:rFonts w:eastAsia="Times New Roman"/>
-          <w:u w:val="single"/>
-        </w:rPr>
-        <w:t>: Beyond Journey’s End</w:t>
-      </w:r>
-      <w:r>
-        <w:rPr>
-          <w:rFonts w:eastAsia="Times New Roman"/>
-        </w:rPr>
-        <w:t xml:space="preserve"> (2023):</w:t>
-      </w:r>
-      <w:r>
-        <w:rPr>
-          <w:rFonts w:eastAsia="Times New Roman"/>
-        </w:rPr>
-        <w:t xml:space="preserve"> </w:t>
-      </w:r>
-      <w:r>
-        <w:rPr>
-          <w:rFonts w:eastAsia="Times New Roman"/>
-        </w:rPr>
-        <w:t>Currently airing with two seasons, t</w:t>
-      </w:r>
-      <w:r>
-        <w:rPr>
-          <w:rFonts w:eastAsia="Times New Roman"/>
-        </w:rPr>
-        <w:t>his anime is the current gold-standard for how great anime can be.</w:t>
-      </w:r>
-      <w:r>
-        <w:rPr>
-          <w:rFonts w:eastAsia="Times New Roman"/>
-        </w:rPr>
-        <w:t xml:space="preserve"> This series is about the titular </w:t>
-      </w:r>
-      <w:r>
-        <w:rPr>
-          <w:rFonts w:eastAsia="Times New Roman"/>
-        </w:rPr>
-        <w:t xml:space="preserve">immortal </w:t>
-      </w:r>
-      <w:r>
-        <w:rPr>
-          <w:rFonts w:eastAsia="Times New Roman"/>
-        </w:rPr>
-        <w:t xml:space="preserve">elf </w:t>
-      </w:r>
-      <w:r>
-        <w:rPr>
-          <w:rFonts w:eastAsia="Times New Roman"/>
-        </w:rPr>
-        <w:t>Frieren</w:t>
-      </w:r>
-      <w:r>
-        <w:rPr>
-          <w:rFonts w:eastAsia="Times New Roman"/>
-        </w:rPr>
-        <w:t>, a former member of “The Hero’s Party,” who had vanquished the Demon King and his army 80 years prior to the events of the story</w:t>
-      </w:r>
-      <w:r>
-        <w:rPr>
-          <w:rFonts w:eastAsia="Times New Roman"/>
-        </w:rPr>
-        <w:t>. A</w:t>
-      </w:r>
-      <w:r>
-        <w:rPr>
-          <w:rFonts w:eastAsia="Times New Roman"/>
-        </w:rPr>
-        <w:t xml:space="preserve">fter the death of the beloved hero Himmel, </w:t>
-      </w:r>
-      <w:r>
-        <w:rPr>
-          <w:rFonts w:eastAsia="Times New Roman"/>
-        </w:rPr>
-        <w:t>Frieren</w:t>
-      </w:r>
-      <w:r>
-        <w:rPr>
-          <w:rFonts w:eastAsia="Times New Roman"/>
-        </w:rPr>
-        <w:t xml:space="preserve"> </w:t>
-      </w:r>
-      <w:r>
-        <w:rPr>
-          <w:rFonts w:eastAsia="Times New Roman"/>
-        </w:rPr>
-        <w:t>sets on a journey</w:t>
-      </w:r>
-      <w:r>
-        <w:rPr>
-          <w:rFonts w:eastAsia="Times New Roman"/>
-        </w:rPr>
-        <w:t xml:space="preserve"> to the land of the dead</w:t>
-      </w:r>
-      <w:r>
-        <w:rPr>
-          <w:rFonts w:eastAsia="Times New Roman"/>
-        </w:rPr>
-        <w:t xml:space="preserve"> </w:t>
-      </w:r>
-      <w:r>
-        <w:rPr>
-          <w:rFonts w:eastAsia="Times New Roman"/>
-        </w:rPr>
-        <w:t xml:space="preserve">along with the </w:t>
-      </w:r>
-      <w:r>
-        <w:rPr>
-          <w:rFonts w:eastAsia="Times New Roman"/>
-        </w:rPr>
-        <w:t xml:space="preserve">current </w:t>
-      </w:r>
-      <w:r>
-        <w:rPr>
-          <w:rFonts w:eastAsia="Times New Roman"/>
-        </w:rPr>
-        <w:t>disciples of her former party-members.</w:t>
-      </w:r>
-      <w:r>
-        <w:rPr>
-          <w:rFonts w:eastAsia="Times New Roman"/>
-        </w:rPr>
-        <w:t xml:space="preserve"> </w:t>
-      </w:r>
-      <w:r>
-        <w:rPr>
-          <w:rFonts w:eastAsia="Times New Roman"/>
-        </w:rPr>
-        <w:t>Both dubbed and subtitled in English, this series is a slow-burn</w:t>
-      </w:r>
-      <w:r>
-        <w:rPr>
-          <w:rFonts w:eastAsia="Times New Roman"/>
-        </w:rPr>
-        <w:t>, cozy</w:t>
-      </w:r>
-      <w:r>
-        <w:rPr>
-          <w:rFonts w:eastAsia="Times New Roman"/>
-        </w:rPr>
-        <w:t xml:space="preserve"> fantasy anime about living in the moment and appreciating the </w:t>
-      </w:r>
-      <w:r>
-        <w:rPr>
-          <w:rFonts w:eastAsia="Times New Roman"/>
-        </w:rPr>
-        <w:t>small things</w:t>
-      </w:r>
-      <w:r>
-        <w:rPr>
-          <w:rFonts w:eastAsia="Times New Roman"/>
-        </w:rPr>
-        <w:t xml:space="preserve"> in life.</w:t>
-      </w:r>
-      <w:r>
-        <w:rPr>
-          <w:rFonts w:eastAsia="Times New Roman"/>
-        </w:rPr>
-        <w:t xml:space="preserve"> </w:t>
-      </w:r>
-      <w:r>
-        <w:rPr>
-          <w:rFonts w:eastAsia="Times New Roman"/>
-        </w:rPr>
-        <w:t xml:space="preserve">Coupled with </w:t>
-      </w:r>
-      <w:r>
-        <w:rPr>
-          <w:rFonts w:eastAsia="Times New Roman"/>
-        </w:rPr>
-        <w:t>good writing</w:t>
-      </w:r>
-      <w:r>
-        <w:rPr>
-          <w:rFonts w:eastAsia="Times New Roman"/>
-        </w:rPr>
-        <w:t xml:space="preserve"> and excellent animation, </w:t>
-      </w:r>
-      <w:r>
-        <w:rPr>
-          <w:rFonts w:eastAsia="Times New Roman"/>
-        </w:rPr>
-        <w:t>Frieren</w:t>
-      </w:r>
-      <w:r>
-        <w:rPr>
-          <w:rFonts w:eastAsia="Times New Roman"/>
-        </w:rPr>
-        <w:t xml:space="preserve">: Beyond Journey’s End is </w:t>
-      </w:r>
-      <w:r>
-        <w:rPr>
-          <w:rFonts w:eastAsia="Times New Roman"/>
-        </w:rPr>
-        <w:t>a great place</w:t>
-      </w:r>
-      <w:r>
-        <w:rPr>
-          <w:rFonts w:eastAsia="Times New Roman"/>
-        </w:rPr>
-        <w:t xml:space="preserve"> to start watching anime.</w:t>
-      </w:r>
-      <w:r>
-        <w:rPr>
-          <w:rFonts w:eastAsia="Times New Roman"/>
-        </w:rPr>
-        <w:t xml:space="preserve"> </w:t>
-      </w:r>
-      <w:r>
-        <w:rPr>
-          <w:rFonts w:eastAsia="Times New Roman"/>
-        </w:rPr>
-        <w:t>This anime is adapted from a manga of the same name, which has been in hiatus since October 2025.</w:t>
-      </w:r>
-    </w:p>
-    <w:p>
-      <w:pPr>
-        <w:jc w:val="center"/>
-        <w:rPr>
-          <w:rFonts w:eastAsia="Times New Roman"/>
-        </w:rPr>
-      </w:pPr>
-      <w:r>
-        <w:rPr>
-          <w:rFonts w:eastAsia="Times New Roman"/>
-        </w:rPr>
-        <w:t>Genre: fantasy, magic, adventure</w:t>
-      </w:r>
-      <w:r>
-        <w:rPr>
-          <w:rFonts w:eastAsia="Times New Roman"/>
-        </w:rPr>
-        <w:t>, slice-of-life, drama, slow-pace</w:t>
-      </w:r>
-    </w:p>
-    <w:p>
-      <w:pPr>
-        <w:spacing w:line="259" w:lineRule="auto"/>
-        <w:jc w:val="center"/>
-        <w:rPr>
-          <w:rFonts w:eastAsia="Times New Roman"/>
-        </w:rPr>
-      </w:pPr>
-      <w:r>
+          <w:noProof/>
+        </w:rPr>
         <w:drawing>
-          <wp:inline wp14:editId="473978B7" wp14:anchorId="688B51E5">
+          <wp:inline distT="0" distB="0" distL="0" distR="0" wp14:anchorId="688B51E5" wp14:editId="473978B7">
             <wp:extent cx="1441724" cy="2162586"/>
             <wp:effectExtent l="0" t="0" r="0" b="0"/>
             <wp:docPr id="2068850860" name="drawing"/>
             <wp:cNvGraphicFramePr>
-              <a:graphicFrameLocks noChangeAspect="1"/>
+              <a:graphicFrameLocks xmlns:a="http://schemas.openxmlformats.org/drawingml/2006/main" noChangeAspect="1"/>
             </wp:cNvGraphicFramePr>
-            <a:graphic>
-              <a:graphicData xmlns:a="http://schemas.openxmlformats.org/drawingml/2006/main" uri="http://schemas.openxmlformats.org/drawingml/2006/picture">
+            <a:graphic xmlns:a="http://schemas.openxmlformats.org/drawingml/2006/main">
+              <a:graphicData uri="http://schemas.openxmlformats.org/drawingml/2006/picture">
                 <pic:pic xmlns:pic="http://schemas.openxmlformats.org/drawingml/2006/picture">
                   <pic:nvPicPr>
                     <pic:cNvPr id="2068850860" name="Picture 2068850860"/>
                     <pic:cNvPicPr/>
                   </pic:nvPicPr>
                   <pic:blipFill>
-                    <a:blip xmlns:r="http://schemas.openxmlformats.org/officeDocument/2006/relationships" r:embed="rId1023236236">
+                    <a:blip r:embed="rId10">
                       <a:extLst>
                         <a:ext uri="{28A0092B-C50C-407E-A947-70E740481C1C}">
                           <a14:useLocalDpi xmlns:a14="http://schemas.microsoft.com/office/drawing/2010/main"/>
@@ -1972,7 +1680,7 @@
                     </a:stretch>
                   </pic:blipFill>
                   <pic:spPr>
-                    <a:xfrm rot="0">
+                    <a:xfrm>
                       <a:off x="0" y="0"/>
                       <a:ext cx="1441724" cy="2162586"/>
                     </a:xfrm>
@@ -1987,23 +1695,26 @@
         </w:drawing>
       </w:r>
       <w:r>
+        <w:rPr>
+          <w:noProof/>
+        </w:rPr>
         <w:drawing>
-          <wp:inline wp14:editId="5687F4B4" wp14:anchorId="145B02E5">
+          <wp:inline distT="0" distB="0" distL="0" distR="0" wp14:anchorId="145B02E5" wp14:editId="5687F4B4">
             <wp:extent cx="4124325" cy="2167915"/>
             <wp:effectExtent l="0" t="0" r="0" b="0"/>
             <wp:docPr id="1040212288" name="drawing"/>
             <wp:cNvGraphicFramePr>
-              <a:graphicFrameLocks noChangeAspect="1"/>
+              <a:graphicFrameLocks xmlns:a="http://schemas.openxmlformats.org/drawingml/2006/main" noChangeAspect="1"/>
             </wp:cNvGraphicFramePr>
-            <a:graphic>
-              <a:graphicData xmlns:a="http://schemas.openxmlformats.org/drawingml/2006/main" uri="http://schemas.openxmlformats.org/drawingml/2006/picture">
+            <a:graphic xmlns:a="http://schemas.openxmlformats.org/drawingml/2006/main">
+              <a:graphicData uri="http://schemas.openxmlformats.org/drawingml/2006/picture">
                 <pic:pic xmlns:pic="http://schemas.openxmlformats.org/drawingml/2006/picture">
                   <pic:nvPicPr>
                     <pic:cNvPr id="1040212288" name="Picture 1040212288"/>
                     <pic:cNvPicPr/>
                   </pic:nvPicPr>
                   <pic:blipFill>
-                    <a:blip xmlns:r="http://schemas.openxmlformats.org/officeDocument/2006/relationships" r:embed="rId948843527">
+                    <a:blip r:embed="rId11">
                       <a:extLst>
                         <a:ext uri="{28A0092B-C50C-407E-A947-70E740481C1C}">
                           <a14:useLocalDpi xmlns:a14="http://schemas.microsoft.com/office/drawing/2010/main"/>
@@ -2015,7 +1726,7 @@
                     </a:stretch>
                   </pic:blipFill>
                   <pic:spPr>
-                    <a:xfrm rot="0">
+                    <a:xfrm>
                       <a:off x="0" y="0"/>
                       <a:ext cx="4124325" cy="2167915"/>
                     </a:xfrm>
@@ -2083,31 +1794,7 @@
         <w:rPr>
           <w:rFonts w:eastAsia="Times New Roman"/>
         </w:rPr>
-        <w:t xml:space="preserve">travels of a pacifist </w:t>
-      </w:r>
-      <w:r>
-        <w:rPr>
-          <w:rFonts w:eastAsia="Times New Roman"/>
-        </w:rPr>
-        <w:t>gunman</w:t>
-      </w:r>
-      <w:r>
-        <w:rPr>
-          <w:rFonts w:eastAsia="Times New Roman"/>
-        </w:rPr>
-        <w:t xml:space="preserve"> wandering the dog-eat-dog planet of No Man’s Land, also called Gunsmoke depending </w:t>
-      </w:r>
-      <w:r>
-        <w:rPr>
-          <w:rFonts w:eastAsia="Times New Roman"/>
-        </w:rPr>
-        <w:t>of</w:t>
-      </w:r>
-      <w:r>
-        <w:rPr>
-          <w:rFonts w:eastAsia="Times New Roman"/>
-        </w:rPr>
-        <w:t xml:space="preserve"> what version is being watched.</w:t>
+        <w:t>travels of a pacifist gunman wandering the dog-eat-dog planet of No Man’s Land, also called Gunsmoke depending of what version is being watched.</w:t>
       </w:r>
       <w:r>
         <w:rPr>
@@ -2119,19 +1806,7 @@
         <w:rPr>
           <w:rFonts w:eastAsia="Times New Roman"/>
         </w:rPr>
-        <w:t xml:space="preserve">Both dubbed and subtitled for English fans, this series starts off as an episodic space-western </w:t>
-      </w:r>
-      <w:r>
-        <w:rPr>
-          <w:rFonts w:eastAsia="Times New Roman"/>
-        </w:rPr>
-        <w:t>sci-fi, and</w:t>
-      </w:r>
-      <w:r>
-        <w:rPr>
-          <w:rFonts w:eastAsia="Times New Roman"/>
-        </w:rPr>
-        <w:t xml:space="preserve"> evolves into high-stakes </w:t>
+        <w:t xml:space="preserve">Both dubbed and subtitled for English fans, this series starts off as an episodic space-western sci-fi, and evolves into high-stakes </w:t>
       </w:r>
       <w:r>
         <w:rPr>
@@ -2173,13 +1848,8 @@
         <w:rPr>
           <w:rFonts w:eastAsia="Times New Roman"/>
         </w:rPr>
-        <w:t>story-lines</w:t>
-      </w:r>
-      <w:r>
-        <w:rPr>
-          <w:rFonts w:eastAsia="Times New Roman"/>
-        </w:rPr>
-        <w:t xml:space="preserve"> concerning the protagonist Vash the Stampede</w:t>
+        <w:lastRenderedPageBreak/>
+        <w:t>story-lines concerning the protagonist Vash the Stampede</w:t>
       </w:r>
       <w:r>
         <w:rPr>
@@ -2191,31 +1861,7 @@
         <w:rPr>
           <w:rFonts w:eastAsia="Times New Roman"/>
         </w:rPr>
-        <w:t xml:space="preserve"> If old-school </w:t>
-      </w:r>
-      <w:r>
-        <w:rPr>
-          <w:rFonts w:eastAsia="Times New Roman"/>
-        </w:rPr>
-        <w:t>isn’t</w:t>
-      </w:r>
-      <w:r>
-        <w:rPr>
-          <w:rFonts w:eastAsia="Times New Roman"/>
-        </w:rPr>
-        <w:t xml:space="preserve"> your style, </w:t>
-      </w:r>
-      <w:r>
-        <w:rPr>
-          <w:rFonts w:eastAsia="Times New Roman"/>
-        </w:rPr>
-        <w:t>there’s</w:t>
-      </w:r>
-      <w:r>
-        <w:rPr>
-          <w:rFonts w:eastAsia="Times New Roman"/>
-        </w:rPr>
-        <w:t xml:space="preserve"> also the on-going reboot</w:t>
+        <w:t xml:space="preserve"> If old-school isn’t your style, there’s also the on-going reboot</w:t>
       </w:r>
       <w:r>
         <w:rPr>
@@ -2245,13 +1891,7 @@
         <w:rPr>
           <w:rFonts w:eastAsia="Times New Roman"/>
         </w:rPr>
-        <w:t>its</w:t>
-      </w:r>
-      <w:r>
-        <w:rPr>
-          <w:rFonts w:eastAsia="Times New Roman"/>
-        </w:rPr>
-        <w:t xml:space="preserve"> sequel series Trigun </w:t>
+        <w:t xml:space="preserve">its sequel series Trigun </w:t>
       </w:r>
       <w:r>
         <w:rPr>
@@ -2280,11 +1920,7 @@
     </w:p>
     <w:p>
       <w:pPr>
-        <w:pStyle w:val="Normal"/>
-        <w:suppressLineNumbers w:val="0"/>
-        <w:bidi w:val="0"/>
-        <w:spacing w:before="0" w:beforeAutospacing="off" w:after="0" w:afterAutospacing="off" w:line="259" w:lineRule="auto"/>
-        <w:ind w:left="0" w:right="0"/>
+        <w:spacing w:line="259" w:lineRule="auto"/>
         <w:jc w:val="center"/>
         <w:rPr>
           <w:rFonts w:eastAsia="Times New Roman"/>
@@ -2317,23 +1953,26 @@
         </w:rPr>
       </w:pPr>
       <w:r>
+        <w:rPr>
+          <w:noProof/>
+        </w:rPr>
         <w:drawing>
-          <wp:inline wp14:editId="77AC7950" wp14:anchorId="7AE01D0E">
+          <wp:inline distT="0" distB="0" distL="0" distR="0" wp14:anchorId="7AE01D0E" wp14:editId="77AC7950">
             <wp:extent cx="1641720" cy="2338889"/>
             <wp:effectExtent l="0" t="0" r="0" b="0"/>
             <wp:docPr id="1644723529" name="drawing"/>
             <wp:cNvGraphicFramePr>
-              <a:graphicFrameLocks noChangeAspect="1"/>
+              <a:graphicFrameLocks xmlns:a="http://schemas.openxmlformats.org/drawingml/2006/main" noChangeAspect="1"/>
             </wp:cNvGraphicFramePr>
-            <a:graphic>
-              <a:graphicData xmlns:a="http://schemas.openxmlformats.org/drawingml/2006/main" uri="http://schemas.openxmlformats.org/drawingml/2006/picture">
+            <a:graphic xmlns:a="http://schemas.openxmlformats.org/drawingml/2006/main">
+              <a:graphicData uri="http://schemas.openxmlformats.org/drawingml/2006/picture">
                 <pic:pic xmlns:pic="http://schemas.openxmlformats.org/drawingml/2006/picture">
                   <pic:nvPicPr>
                     <pic:cNvPr id="1644723529" name="Picture 1644723529"/>
                     <pic:cNvPicPr/>
                   </pic:nvPicPr>
                   <pic:blipFill>
-                    <a:blip xmlns:r="http://schemas.openxmlformats.org/officeDocument/2006/relationships" r:embed="rId1147822282">
+                    <a:blip r:embed="rId12">
                       <a:extLst>
                         <a:ext uri="{28A0092B-C50C-407E-A947-70E740481C1C}">
                           <a14:useLocalDpi xmlns:a14="http://schemas.microsoft.com/office/drawing/2010/main"/>
@@ -2345,7 +1984,7 @@
                     </a:stretch>
                   </pic:blipFill>
                   <pic:spPr>
-                    <a:xfrm rot="0">
+                    <a:xfrm>
                       <a:off x="0" y="0"/>
                       <a:ext cx="1641720" cy="2338889"/>
                     </a:xfrm>
@@ -2360,23 +1999,26 @@
         </w:drawing>
       </w:r>
       <w:r>
+        <w:rPr>
+          <w:noProof/>
+        </w:rPr>
         <w:drawing>
-          <wp:inline wp14:editId="276092AA" wp14:anchorId="3126678B">
+          <wp:inline distT="0" distB="0" distL="0" distR="0" wp14:anchorId="3126678B" wp14:editId="276092AA">
             <wp:extent cx="3425964" cy="2327899"/>
             <wp:effectExtent l="0" t="0" r="0" b="0"/>
             <wp:docPr id="967625518" name="drawing"/>
             <wp:cNvGraphicFramePr>
-              <a:graphicFrameLocks noChangeAspect="1"/>
+              <a:graphicFrameLocks xmlns:a="http://schemas.openxmlformats.org/drawingml/2006/main" noChangeAspect="1"/>
             </wp:cNvGraphicFramePr>
-            <a:graphic>
-              <a:graphicData xmlns:a="http://schemas.openxmlformats.org/drawingml/2006/main" uri="http://schemas.openxmlformats.org/drawingml/2006/picture">
+            <a:graphic xmlns:a="http://schemas.openxmlformats.org/drawingml/2006/main">
+              <a:graphicData uri="http://schemas.openxmlformats.org/drawingml/2006/picture">
                 <pic:pic xmlns:pic="http://schemas.openxmlformats.org/drawingml/2006/picture">
                   <pic:nvPicPr>
                     <pic:cNvPr id="967625518" name="Picture 967625518"/>
                     <pic:cNvPicPr/>
                   </pic:nvPicPr>
                   <pic:blipFill>
-                    <a:blip xmlns:r="http://schemas.openxmlformats.org/officeDocument/2006/relationships" r:embed="rId1277127654">
+                    <a:blip r:embed="rId13">
                       <a:extLst>
                         <a:ext uri="{28A0092B-C50C-407E-A947-70E740481C1C}">
                           <a14:useLocalDpi xmlns:a14="http://schemas.microsoft.com/office/drawing/2010/main"/>
@@ -2388,7 +2030,7 @@
                     </a:stretch>
                   </pic:blipFill>
                   <pic:spPr>
-                    <a:xfrm rot="0">
+                    <a:xfrm>
                       <a:off x="0" y="0"/>
                       <a:ext cx="3425964" cy="2327899"/>
                     </a:xfrm>
@@ -2414,11 +2056,7 @@
     </w:p>
     <w:p>
       <w:pPr>
-        <w:pStyle w:val="Normal"/>
-        <w:suppressLineNumbers w:val="0"/>
-        <w:bidi w:val="0"/>
-        <w:spacing w:before="0" w:beforeAutospacing="off" w:after="0" w:afterAutospacing="off" w:line="259" w:lineRule="auto"/>
-        <w:ind w:left="0" w:right="0"/>
+        <w:spacing w:line="259" w:lineRule="auto"/>
         <w:jc w:val="center"/>
         <w:rPr>
           <w:rFonts w:eastAsia="Times New Roman"/>
@@ -2459,13 +2097,7 @@
         <w:rPr>
           <w:rFonts w:eastAsia="Times New Roman"/>
         </w:rPr>
-        <w:t xml:space="preserve">romance about a spoiled rich girl. Do not be fooled by this </w:t>
-      </w:r>
-      <w:r>
-        <w:rPr>
-          <w:rFonts w:eastAsia="Times New Roman"/>
-        </w:rPr>
-        <w:t>initial</w:t>
+        <w:t>romance about a spoiled rich girl. Do not be fooled by this initial</w:t>
       </w:r>
       <w:r>
         <w:rPr>
@@ -2477,7 +2109,55 @@
         <w:rPr>
           <w:rFonts w:eastAsia="Times New Roman"/>
         </w:rPr>
-        <w:t xml:space="preserve">it quickly reveals itself to be </w:t>
+        <w:t xml:space="preserve">it quickly reveals itself to be a </w:t>
+      </w:r>
+      <w:r>
+        <w:rPr>
+          <w:rFonts w:eastAsia="Times New Roman"/>
+        </w:rPr>
+        <w:t xml:space="preserve">emotional </w:t>
+      </w:r>
+      <w:r>
+        <w:rPr>
+          <w:rFonts w:eastAsia="Times New Roman"/>
+        </w:rPr>
+        <w:t xml:space="preserve">tale of </w:t>
+      </w:r>
+      <w:r>
+        <w:rPr>
+          <w:rFonts w:eastAsia="Times New Roman"/>
+        </w:rPr>
+        <w:t>political intrigue</w:t>
+      </w:r>
+      <w:r>
+        <w:rPr>
+          <w:rFonts w:eastAsia="Times New Roman"/>
+        </w:rPr>
+        <w:t xml:space="preserve">, as </w:t>
+      </w:r>
+      <w:r>
+        <w:rPr>
+          <w:rFonts w:eastAsia="Times New Roman"/>
+        </w:rPr>
+        <w:t xml:space="preserve">the sheltered </w:t>
+      </w:r>
+      <w:r>
+        <w:rPr>
+          <w:rFonts w:eastAsia="Times New Roman"/>
+        </w:rPr>
+        <w:t xml:space="preserve">princess Yona </w:t>
+      </w:r>
+      <w:r>
+        <w:rPr>
+          <w:rFonts w:eastAsia="Times New Roman"/>
+        </w:rPr>
+        <w:t xml:space="preserve">and her guard Hak must flee the </w:t>
+      </w:r>
+      <w:r>
+        <w:rPr>
+          <w:rFonts w:eastAsia="Times New Roman"/>
+        </w:rPr>
+        <w:t xml:space="preserve">castle after a coup &amp; attempt on her life. Now, she must reinvent herself from </w:t>
       </w:r>
       <w:r>
         <w:rPr>
@@ -2495,55 +2175,43 @@
         <w:rPr>
           <w:rFonts w:eastAsia="Times New Roman"/>
         </w:rPr>
-        <w:t xml:space="preserve">emotional </w:t>
-      </w:r>
-      <w:r>
-        <w:rPr>
-          <w:rFonts w:eastAsia="Times New Roman"/>
-        </w:rPr>
-        <w:t xml:space="preserve">tale of </w:t>
-      </w:r>
-      <w:r>
-        <w:rPr>
-          <w:rFonts w:eastAsia="Times New Roman"/>
-        </w:rPr>
-        <w:t>political intrigue</w:t>
-      </w:r>
-      <w:r>
-        <w:rPr>
-          <w:rFonts w:eastAsia="Times New Roman"/>
-        </w:rPr>
-        <w:t xml:space="preserve">, as </w:t>
-      </w:r>
-      <w:r>
-        <w:rPr>
-          <w:rFonts w:eastAsia="Times New Roman"/>
-        </w:rPr>
-        <w:t xml:space="preserve">the sheltered </w:t>
-      </w:r>
-      <w:r>
-        <w:rPr>
-          <w:rFonts w:eastAsia="Times New Roman"/>
-        </w:rPr>
-        <w:t xml:space="preserve">princess Yona </w:t>
-      </w:r>
-      <w:r>
-        <w:rPr>
-          <w:rFonts w:eastAsia="Times New Roman"/>
-        </w:rPr>
-        <w:t xml:space="preserve">and her guard Hak must flee the </w:t>
-      </w:r>
-      <w:r>
-        <w:rPr>
-          <w:rFonts w:eastAsia="Times New Roman"/>
-        </w:rPr>
-        <w:t xml:space="preserve">castle after a coup &amp; attempt on her life. Now, she must reinvent herself from </w:t>
-      </w:r>
-      <w:r>
-        <w:rPr>
-          <w:rFonts w:eastAsia="Times New Roman"/>
-        </w:rPr>
-        <w:t>a</w:t>
+        <w:t>whiny</w:t>
+      </w:r>
+      <w:r>
+        <w:rPr>
+          <w:rFonts w:eastAsia="Times New Roman"/>
+        </w:rPr>
+        <w:t xml:space="preserve">, </w:t>
+      </w:r>
+      <w:r>
+        <w:rPr>
+          <w:rFonts w:eastAsia="Times New Roman"/>
+        </w:rPr>
+        <w:t xml:space="preserve">sheltered princess into the courageous leader of </w:t>
+      </w:r>
+      <w:r>
+        <w:rPr>
+          <w:rFonts w:eastAsia="Times New Roman"/>
+        </w:rPr>
+        <w:t xml:space="preserve">an ensemble of </w:t>
+      </w:r>
+      <w:r>
+        <w:rPr>
+          <w:rFonts w:eastAsia="Times New Roman"/>
+        </w:rPr>
+        <w:t>prophetic warriors</w:t>
+      </w:r>
+      <w:r>
+        <w:rPr>
+          <w:rFonts w:eastAsia="Times New Roman"/>
+        </w:rPr>
+        <w:t xml:space="preserve"> &amp; revolutionaries</w:t>
+      </w:r>
+      <w:r>
+        <w:rPr>
+          <w:rFonts w:eastAsia="Times New Roman"/>
+        </w:rPr>
+        <w:t>.</w:t>
       </w:r>
       <w:r>
         <w:rPr>
@@ -2555,106 +2223,24 @@
         <w:rPr>
           <w:rFonts w:eastAsia="Times New Roman"/>
         </w:rPr>
-        <w:t>whiny</w:t>
-      </w:r>
-      <w:r>
-        <w:rPr>
-          <w:rFonts w:eastAsia="Times New Roman"/>
-        </w:rPr>
-        <w:t xml:space="preserve">, </w:t>
-      </w:r>
-      <w:r>
-        <w:rPr>
-          <w:rFonts w:eastAsia="Times New Roman"/>
-        </w:rPr>
-        <w:t xml:space="preserve">sheltered princess into the courageous leader of </w:t>
-      </w:r>
-      <w:r>
-        <w:rPr>
-          <w:rFonts w:eastAsia="Times New Roman"/>
-        </w:rPr>
-        <w:t xml:space="preserve">an ensemble of </w:t>
-      </w:r>
-      <w:r>
-        <w:rPr>
-          <w:rFonts w:eastAsia="Times New Roman"/>
-        </w:rPr>
-        <w:t>prophetic warriors</w:t>
-      </w:r>
-      <w:r>
-        <w:rPr>
-          <w:rFonts w:eastAsia="Times New Roman"/>
-        </w:rPr>
-        <w:t xml:space="preserve"> &amp; revolutionaries</w:t>
-      </w:r>
-      <w:r>
-        <w:rPr>
-          <w:rFonts w:eastAsia="Times New Roman"/>
-        </w:rPr>
-        <w:t>.</w:t>
-      </w:r>
-      <w:r>
-        <w:rPr>
-          <w:rFonts w:eastAsia="Times New Roman"/>
-        </w:rPr>
-        <w:t xml:space="preserve"> </w:t>
-      </w:r>
-      <w:r>
-        <w:rPr>
-          <w:rFonts w:eastAsia="Times New Roman"/>
-        </w:rPr>
-        <w:t xml:space="preserve">This anime is very faithfully adapted from a manga of the same </w:t>
-      </w:r>
-      <w:r>
-        <w:rPr>
-          <w:rFonts w:eastAsia="Times New Roman"/>
-        </w:rPr>
-        <w:t>name</w:t>
-      </w:r>
-      <w:r>
-        <w:rPr>
-          <w:rFonts w:eastAsia="Times New Roman"/>
-        </w:rPr>
-        <w:t>, and</w:t>
-      </w:r>
-      <w:r>
-        <w:rPr>
-          <w:rFonts w:eastAsia="Times New Roman"/>
-        </w:rPr>
-        <w:t xml:space="preserve"> is recommended for fans of emotional </w:t>
-      </w:r>
-      <w:r>
-        <w:rPr>
-          <w:rFonts w:eastAsia="Times New Roman"/>
-        </w:rPr>
-        <w:t>story-telling</w:t>
-      </w:r>
-      <w:r>
-        <w:rPr>
-          <w:rFonts w:eastAsia="Times New Roman"/>
-        </w:rPr>
-        <w:t xml:space="preserve"> coupled with </w:t>
-      </w:r>
-      <w:r>
-        <w:rPr>
-          <w:rFonts w:eastAsia="Times New Roman"/>
-        </w:rPr>
-        <w:t>excellently-paced</w:t>
-      </w:r>
-      <w:r>
-        <w:rPr>
-          <w:rFonts w:eastAsia="Times New Roman"/>
-        </w:rPr>
-        <w:t xml:space="preserve"> action.</w:t>
-      </w:r>
-    </w:p>
-    <w:p>
-      <w:pPr>
-        <w:pStyle w:val="Normal"/>
-        <w:suppressLineNumbers w:val="0"/>
-        <w:bidi w:val="0"/>
-        <w:spacing w:before="0" w:beforeAutospacing="off" w:after="0" w:afterAutospacing="off" w:line="259" w:lineRule="auto"/>
-        <w:ind w:left="0" w:right="0"/>
+        <w:t>This anime is very faithfully adapted from a manga of the same name</w:t>
+      </w:r>
+      <w:r>
+        <w:rPr>
+          <w:rFonts w:eastAsia="Times New Roman"/>
+        </w:rPr>
+        <w:t>, and is recommended for fans of emotional story-telling</w:t>
+      </w:r>
+      <w:r>
+        <w:rPr>
+          <w:rFonts w:eastAsia="Times New Roman"/>
+        </w:rPr>
+        <w:t xml:space="preserve"> coupled with excellently-paced action.</w:t>
+      </w:r>
+    </w:p>
+    <w:p>
+      <w:pPr>
+        <w:spacing w:line="259" w:lineRule="auto"/>
         <w:jc w:val="center"/>
         <w:rPr>
           <w:rFonts w:eastAsia="Times New Roman"/>
@@ -2682,23 +2268,26 @@
         </w:rPr>
       </w:pPr>
       <w:r>
+        <w:rPr>
+          <w:noProof/>
+        </w:rPr>
         <w:drawing>
-          <wp:inline wp14:editId="133C44AE" wp14:anchorId="4A8316F3">
+          <wp:inline distT="0" distB="0" distL="0" distR="0" wp14:anchorId="4A8316F3" wp14:editId="133C44AE">
             <wp:extent cx="1641019" cy="2235798"/>
             <wp:effectExtent l="0" t="0" r="0" b="0"/>
             <wp:docPr id="1096281802" name="drawing"/>
             <wp:cNvGraphicFramePr>
-              <a:graphicFrameLocks noChangeAspect="1"/>
+              <a:graphicFrameLocks xmlns:a="http://schemas.openxmlformats.org/drawingml/2006/main" noChangeAspect="1"/>
             </wp:cNvGraphicFramePr>
-            <a:graphic>
-              <a:graphicData xmlns:a="http://schemas.openxmlformats.org/drawingml/2006/main" uri="http://schemas.openxmlformats.org/drawingml/2006/picture">
+            <a:graphic xmlns:a="http://schemas.openxmlformats.org/drawingml/2006/main">
+              <a:graphicData uri="http://schemas.openxmlformats.org/drawingml/2006/picture">
                 <pic:pic xmlns:pic="http://schemas.openxmlformats.org/drawingml/2006/picture">
                   <pic:nvPicPr>
                     <pic:cNvPr id="1096281802" name="Picture 1096281802"/>
                     <pic:cNvPicPr/>
                   </pic:nvPicPr>
                   <pic:blipFill>
-                    <a:blip xmlns:r="http://schemas.openxmlformats.org/officeDocument/2006/relationships" r:embed="rId168567398">
+                    <a:blip r:embed="rId14">
                       <a:extLst>
                         <a:ext uri="{28A0092B-C50C-407E-A947-70E740481C1C}">
                           <a14:useLocalDpi xmlns:a14="http://schemas.microsoft.com/office/drawing/2010/main"/>
@@ -2710,7 +2299,7 @@
                     </a:stretch>
                   </pic:blipFill>
                   <pic:spPr>
-                    <a:xfrm rot="0">
+                    <a:xfrm>
                       <a:off x="0" y="0"/>
                       <a:ext cx="1641019" cy="2235798"/>
                     </a:xfrm>
@@ -2725,23 +2314,26 @@
         </w:drawing>
       </w:r>
       <w:r>
+        <w:rPr>
+          <w:noProof/>
+        </w:rPr>
         <w:drawing>
-          <wp:inline wp14:editId="653DC67A" wp14:anchorId="78B5AB37">
+          <wp:inline distT="0" distB="0" distL="0" distR="0" wp14:anchorId="78B5AB37" wp14:editId="653DC67A">
             <wp:extent cx="3990975" cy="2244923"/>
             <wp:effectExtent l="0" t="0" r="0" b="0"/>
             <wp:docPr id="27979535" name="drawing"/>
             <wp:cNvGraphicFramePr>
-              <a:graphicFrameLocks noChangeAspect="1"/>
+              <a:graphicFrameLocks xmlns:a="http://schemas.openxmlformats.org/drawingml/2006/main" noChangeAspect="1"/>
             </wp:cNvGraphicFramePr>
-            <a:graphic>
-              <a:graphicData xmlns:a="http://schemas.openxmlformats.org/drawingml/2006/main" uri="http://schemas.openxmlformats.org/drawingml/2006/picture">
+            <a:graphic xmlns:a="http://schemas.openxmlformats.org/drawingml/2006/main">
+              <a:graphicData uri="http://schemas.openxmlformats.org/drawingml/2006/picture">
                 <pic:pic xmlns:pic="http://schemas.openxmlformats.org/drawingml/2006/picture">
                   <pic:nvPicPr>
                     <pic:cNvPr id="27979535" name="Picture 27979535"/>
                     <pic:cNvPicPr/>
                   </pic:nvPicPr>
                   <pic:blipFill>
-                    <a:blip xmlns:r="http://schemas.openxmlformats.org/officeDocument/2006/relationships" r:embed="rId1277028093">
+                    <a:blip r:embed="rId15">
                       <a:extLst>
                         <a:ext uri="{28A0092B-C50C-407E-A947-70E740481C1C}">
                           <a14:useLocalDpi xmlns:a14="http://schemas.microsoft.com/office/drawing/2010/main"/>
@@ -2753,7 +2345,7 @@
                     </a:stretch>
                   </pic:blipFill>
                   <pic:spPr>
-                    <a:xfrm rot="0">
+                    <a:xfrm>
                       <a:off x="0" y="0"/>
                       <a:ext cx="3990975" cy="2244923"/>
                     </a:xfrm>
@@ -2810,13 +2402,7 @@
         <w:rPr>
           <w:rFonts w:eastAsia="Times New Roman"/>
         </w:rPr>
-        <w:t>Misc</w:t>
-      </w:r>
-      <w:r>
-        <w:rPr>
-          <w:rFonts w:eastAsia="Times New Roman"/>
-        </w:rPr>
-        <w:t xml:space="preserve"> Page</w:t>
+        <w:t>Misc Page</w:t>
       </w:r>
       <w:r>
         <w:rPr>
@@ -2842,7 +2428,6 @@
       <w:r>
         <w:rPr>
           <w:rFonts w:eastAsia="Times New Roman"/>
-          <w:u w:val="none"/>
         </w:rPr>
         <w:t>[</w:t>
       </w:r>
@@ -2856,28 +2441,24 @@
       <w:r>
         <w:rPr>
           <w:rFonts w:eastAsia="Times New Roman"/>
-          <w:u w:val="none"/>
         </w:rPr>
         <w:t>]</w:t>
       </w:r>
       <w:r>
         <w:rPr>
           <w:rFonts w:eastAsia="Times New Roman"/>
-          <w:u w:val="none"/>
         </w:rPr>
         <w:t xml:space="preserve"> </w:t>
       </w:r>
       <w:r>
         <w:rPr>
           <w:rFonts w:eastAsia="Times New Roman"/>
-          <w:u w:val="none"/>
         </w:rPr>
         <w:t>“</w:t>
       </w:r>
       <w:r>
         <w:rPr>
           <w:rFonts w:eastAsia="Times New Roman"/>
-          <w:u w:val="none"/>
         </w:rPr>
         <w:t>What is this?”</w:t>
       </w:r>
@@ -2903,13 +2484,122 @@
         <w:rPr>
           <w:rFonts w:eastAsia="Times New Roman"/>
         </w:rPr>
-        <w:t xml:space="preserve">? Well, </w:t>
-      </w:r>
-      <w:r>
-        <w:rPr>
-          <w:rFonts w:eastAsia="Times New Roman"/>
-        </w:rPr>
-        <w:t>you’re in</w:t>
+        <w:t>? Well, you’re in luck because I also have non-anime recommendations for series!</w:t>
+      </w:r>
+      <w:r>
+        <w:rPr>
+          <w:rFonts w:eastAsia="Times New Roman"/>
+        </w:rPr>
+        <w:t xml:space="preserve"> Shortened from the word miscellaneous, the “misc” page of this website is consisting of </w:t>
+      </w:r>
+      <w:r>
+        <w:rPr>
+          <w:rFonts w:eastAsia="Times New Roman"/>
+        </w:rPr>
+        <w:lastRenderedPageBreak/>
+        <w:t>recommendations of shows or series that aren’t strictly anime, whether they be comics, cartoons or books.</w:t>
+      </w:r>
+    </w:p>
+    <w:p>
+      <w:pPr>
+        <w:spacing w:line="259" w:lineRule="auto"/>
+        <w:jc w:val="center"/>
+        <w:rPr>
+          <w:rFonts w:eastAsia="Times New Roman"/>
+        </w:rPr>
+      </w:pPr>
+    </w:p>
+    <w:p>
+      <w:pPr>
+        <w:jc w:val="center"/>
+        <w:rPr>
+          <w:rFonts w:eastAsia="Times New Roman"/>
+        </w:rPr>
+      </w:pPr>
+      <w:r>
+        <w:rPr>
+          <w:rFonts w:eastAsia="Times New Roman"/>
+          <w:u w:val="single"/>
+        </w:rPr>
+        <w:t>Toilet-Bound Hanako-Kun</w:t>
+      </w:r>
+      <w:r>
+        <w:rPr>
+          <w:rFonts w:eastAsia="Times New Roman"/>
+        </w:rPr>
+        <w:t xml:space="preserve">: </w:t>
+      </w:r>
+      <w:r>
+        <w:rPr>
+          <w:rFonts w:eastAsia="Times New Roman"/>
+        </w:rPr>
+        <w:t>Despite</w:t>
+      </w:r>
+      <w:r>
+        <w:rPr>
+          <w:rFonts w:eastAsia="Times New Roman"/>
+        </w:rPr>
+        <w:t xml:space="preserve"> its name, this series is one of the greats.</w:t>
+      </w:r>
+      <w:r>
+        <w:rPr>
+          <w:rFonts w:eastAsia="Times New Roman"/>
+        </w:rPr>
+        <w:t xml:space="preserve"> This comic series is recommended for those looking for a visually stunning action/adventure series, that soon evolves into a heart-wrenching drama with a large cast of complex characters.</w:t>
+      </w:r>
+      <w:r>
+        <w:rPr>
+          <w:rFonts w:eastAsia="Times New Roman"/>
+        </w:rPr>
+        <w:t xml:space="preserve"> Written and drawn by the</w:t>
+      </w:r>
+      <w:r>
+        <w:rPr>
+          <w:rFonts w:eastAsia="Times New Roman"/>
+        </w:rPr>
+        <w:t xml:space="preserve"> acclaimed</w:t>
+      </w:r>
+      <w:r>
+        <w:rPr>
+          <w:rFonts w:eastAsia="Times New Roman"/>
+        </w:rPr>
+        <w:t xml:space="preserve"> AidaIro duo, </w:t>
+      </w:r>
+      <w:r>
+        <w:rPr>
+          <w:rFonts w:eastAsia="Times New Roman"/>
+        </w:rPr>
+        <w:t xml:space="preserve">Toilet-Bound Hanako-Kun is about </w:t>
+      </w:r>
+      <w:r>
+        <w:rPr>
+          <w:rFonts w:eastAsia="Times New Roman"/>
+        </w:rPr>
+        <w:t>high school</w:t>
+      </w:r>
+      <w:r>
+        <w:rPr>
+          <w:rFonts w:eastAsia="Times New Roman"/>
+        </w:rPr>
+        <w:t>er</w:t>
+      </w:r>
+      <w:r>
+        <w:rPr>
+          <w:rFonts w:eastAsia="Times New Roman"/>
+        </w:rPr>
+        <w:t xml:space="preserve"> Yashiro Nene and her</w:t>
+      </w:r>
+      <w:r>
+        <w:rPr>
+          <w:rFonts w:eastAsia="Times New Roman"/>
+        </w:rPr>
+        <w:t xml:space="preserve"> comic</w:t>
+      </w:r>
+      <w:r>
+        <w:rPr>
+          <w:rFonts w:eastAsia="Times New Roman"/>
+        </w:rPr>
+        <w:t xml:space="preserve"> adventures</w:t>
       </w:r>
       <w:r>
         <w:rPr>
@@ -2921,31 +2611,67 @@
         <w:rPr>
           <w:rFonts w:eastAsia="Times New Roman"/>
         </w:rPr>
-        <w:t>luck</w:t>
-      </w:r>
-      <w:r>
-        <w:rPr>
-          <w:rFonts w:eastAsia="Times New Roman"/>
-        </w:rPr>
-        <w:t xml:space="preserve"> because I also have non-anime recommendations for </w:t>
-      </w:r>
-      <w:r>
-        <w:rPr>
-          <w:rFonts w:eastAsia="Times New Roman"/>
-        </w:rPr>
-        <w:t>series</w:t>
-      </w:r>
-      <w:r>
-        <w:rPr>
-          <w:rFonts w:eastAsia="Times New Roman"/>
-        </w:rPr>
-        <w:t>!</w:t>
-      </w:r>
-      <w:r>
-        <w:rPr>
-          <w:rFonts w:eastAsia="Times New Roman"/>
-        </w:rPr>
-        <w:t xml:space="preserve"> Shortened from the word miscellaneous, the “misc” page of this website is consisting of recommendations of shows or series that aren’t strictly anime, whether they be comics, cartoons or books.</w:t>
+        <w:t>as she navigates</w:t>
+      </w:r>
+      <w:r>
+        <w:rPr>
+          <w:rFonts w:eastAsia="Times New Roman"/>
+        </w:rPr>
+        <w:t xml:space="preserve"> </w:t>
+      </w:r>
+      <w:r>
+        <w:rPr>
+          <w:rFonts w:eastAsia="Times New Roman"/>
+        </w:rPr>
+        <w:t>the complex life of a teenage girl</w:t>
+      </w:r>
+      <w:r>
+        <w:rPr>
+          <w:rFonts w:eastAsia="Times New Roman"/>
+        </w:rPr>
+        <w:t>,</w:t>
+      </w:r>
+      <w:r>
+        <w:rPr>
+          <w:rFonts w:eastAsia="Times New Roman"/>
+        </w:rPr>
+        <w:t xml:space="preserve"> whilst also having to deal with</w:t>
+      </w:r>
+      <w:r>
+        <w:rPr>
+          <w:rFonts w:eastAsia="Times New Roman"/>
+        </w:rPr>
+        <w:t xml:space="preserve"> the dangers and woes of</w:t>
+      </w:r>
+      <w:r>
+        <w:rPr>
+          <w:rFonts w:eastAsia="Times New Roman"/>
+        </w:rPr>
+        <w:t xml:space="preserve"> ghosts and malevolent spirits.</w:t>
+      </w:r>
+      <w:r>
+        <w:rPr>
+          <w:rFonts w:eastAsia="Times New Roman"/>
+        </w:rPr>
+        <w:t xml:space="preserve"> </w:t>
+      </w:r>
+      <w:r>
+        <w:rPr>
+          <w:rFonts w:eastAsia="Times New Roman"/>
+        </w:rPr>
+        <w:t xml:space="preserve">Although there is an anime adaptation, both dubbed and subtitled in English, everything past the second season shows a noticeable drop in quality, so I recommend the </w:t>
+      </w:r>
+      <w:r>
+        <w:rPr>
+          <w:rFonts w:eastAsia="Times New Roman"/>
+        </w:rPr>
+        <w:t xml:space="preserve">manga </w:t>
+      </w:r>
+      <w:r>
+        <w:rPr>
+          <w:rFonts w:eastAsia="Times New Roman"/>
+        </w:rPr>
+        <w:t>over the anime.</w:t>
       </w:r>
     </w:p>
     <w:p>
@@ -2956,221 +2682,6 @@
           <w:rFonts w:eastAsia="Times New Roman"/>
         </w:rPr>
       </w:pPr>
-    </w:p>
-    <w:p>
-      <w:pPr>
-        <w:pStyle w:val="Normal"/>
-        <w:jc w:val="center"/>
-        <w:rPr>
-          <w:rFonts w:eastAsia="Times New Roman"/>
-        </w:rPr>
-      </w:pPr>
-      <w:r>
-        <w:rPr>
-          <w:rFonts w:eastAsia="Times New Roman"/>
-          <w:u w:val="single"/>
-        </w:rPr>
-        <w:t>Toilet-Bound Hanako-Kun</w:t>
-      </w:r>
-      <w:r>
-        <w:rPr>
-          <w:rFonts w:eastAsia="Times New Roman"/>
-        </w:rPr>
-        <w:t xml:space="preserve">: </w:t>
-      </w:r>
-      <w:r>
-        <w:rPr>
-          <w:rFonts w:eastAsia="Times New Roman"/>
-        </w:rPr>
-        <w:t>Despite</w:t>
-      </w:r>
-      <w:r>
-        <w:rPr>
-          <w:rFonts w:eastAsia="Times New Roman"/>
-        </w:rPr>
-        <w:t xml:space="preserve"> its name, this series is one of the </w:t>
-      </w:r>
-      <w:r>
-        <w:rPr>
-          <w:rFonts w:eastAsia="Times New Roman"/>
-        </w:rPr>
-        <w:t>greats</w:t>
-      </w:r>
-      <w:r>
-        <w:rPr>
-          <w:rFonts w:eastAsia="Times New Roman"/>
-        </w:rPr>
-        <w:t>.</w:t>
-      </w:r>
-      <w:r>
-        <w:rPr>
-          <w:rFonts w:eastAsia="Times New Roman"/>
-        </w:rPr>
-        <w:t xml:space="preserve"> This comic series is recommended for those looking for a visually stunning action/adventure </w:t>
-      </w:r>
-      <w:r>
-        <w:rPr>
-          <w:rFonts w:eastAsia="Times New Roman"/>
-        </w:rPr>
-        <w:t>series,</w:t>
-      </w:r>
-      <w:r>
-        <w:rPr>
-          <w:rFonts w:eastAsia="Times New Roman"/>
-        </w:rPr>
-        <w:t xml:space="preserve"> that soon evolves into a heart-wrenching drama with a large cast of complex characters.</w:t>
-      </w:r>
-      <w:r>
-        <w:rPr>
-          <w:rFonts w:eastAsia="Times New Roman"/>
-        </w:rPr>
-        <w:t xml:space="preserve"> Written and drawn by the</w:t>
-      </w:r>
-      <w:r>
-        <w:rPr>
-          <w:rFonts w:eastAsia="Times New Roman"/>
-        </w:rPr>
-        <w:t xml:space="preserve"> acclaimed</w:t>
-      </w:r>
-      <w:r>
-        <w:rPr>
-          <w:rFonts w:eastAsia="Times New Roman"/>
-        </w:rPr>
-        <w:t xml:space="preserve"> </w:t>
-      </w:r>
-      <w:r>
-        <w:rPr>
-          <w:rFonts w:eastAsia="Times New Roman"/>
-        </w:rPr>
-        <w:t>AidaIro</w:t>
-      </w:r>
-      <w:r>
-        <w:rPr>
-          <w:rFonts w:eastAsia="Times New Roman"/>
-        </w:rPr>
-        <w:t xml:space="preserve"> duo, </w:t>
-      </w:r>
-      <w:r>
-        <w:rPr>
-          <w:rFonts w:eastAsia="Times New Roman"/>
-        </w:rPr>
-        <w:t xml:space="preserve">Toilet-Bound Hanako-Kun is about </w:t>
-      </w:r>
-      <w:r>
-        <w:rPr>
-          <w:rFonts w:eastAsia="Times New Roman"/>
-        </w:rPr>
-        <w:t>high school</w:t>
-      </w:r>
-      <w:r>
-        <w:rPr>
-          <w:rFonts w:eastAsia="Times New Roman"/>
-        </w:rPr>
-        <w:t>er</w:t>
-      </w:r>
-      <w:r>
-        <w:rPr>
-          <w:rFonts w:eastAsia="Times New Roman"/>
-        </w:rPr>
-        <w:t xml:space="preserve"> Yashiro Nene and her</w:t>
-      </w:r>
-      <w:r>
-        <w:rPr>
-          <w:rFonts w:eastAsia="Times New Roman"/>
-        </w:rPr>
-        <w:t xml:space="preserve"> comic</w:t>
-      </w:r>
-      <w:r>
-        <w:rPr>
-          <w:rFonts w:eastAsia="Times New Roman"/>
-        </w:rPr>
-        <w:t xml:space="preserve"> adventures</w:t>
-      </w:r>
-      <w:r>
-        <w:rPr>
-          <w:rFonts w:eastAsia="Times New Roman"/>
-        </w:rPr>
-        <w:t xml:space="preserve"> </w:t>
-      </w:r>
-      <w:r>
-        <w:rPr>
-          <w:rFonts w:eastAsia="Times New Roman"/>
-        </w:rPr>
-        <w:t>as she navigates</w:t>
-      </w:r>
-      <w:r>
-        <w:rPr>
-          <w:rFonts w:eastAsia="Times New Roman"/>
-        </w:rPr>
-        <w:t xml:space="preserve"> </w:t>
-      </w:r>
-      <w:r>
-        <w:rPr>
-          <w:rFonts w:eastAsia="Times New Roman"/>
-        </w:rPr>
-        <w:t>the complex life of a teenage girl</w:t>
-      </w:r>
-      <w:r>
-        <w:rPr>
-          <w:rFonts w:eastAsia="Times New Roman"/>
-        </w:rPr>
-        <w:t>,</w:t>
-      </w:r>
-      <w:r>
-        <w:rPr>
-          <w:rFonts w:eastAsia="Times New Roman"/>
-        </w:rPr>
-        <w:t xml:space="preserve"> whilst also having to deal with</w:t>
-      </w:r>
-      <w:r>
-        <w:rPr>
-          <w:rFonts w:eastAsia="Times New Roman"/>
-        </w:rPr>
-        <w:t xml:space="preserve"> the dangers and woes of</w:t>
-      </w:r>
-      <w:r>
-        <w:rPr>
-          <w:rFonts w:eastAsia="Times New Roman"/>
-        </w:rPr>
-        <w:t xml:space="preserve"> ghosts and malevolent spirits.</w:t>
-      </w:r>
-      <w:r>
-        <w:rPr>
-          <w:rFonts w:eastAsia="Times New Roman"/>
-        </w:rPr>
-        <w:t xml:space="preserve"> </w:t>
-      </w:r>
-      <w:r>
-        <w:rPr>
-          <w:rFonts w:eastAsia="Times New Roman"/>
-        </w:rPr>
-        <w:t xml:space="preserve">Although there is an anime adaptation, both dubbed and subtitled in English, everything past the second season shows a noticeable drop in quality, so I recommend the </w:t>
-      </w:r>
-      <w:r>
-        <w:rPr>
-          <w:rFonts w:eastAsia="Times New Roman"/>
-        </w:rPr>
-        <w:t xml:space="preserve">manga </w:t>
-      </w:r>
-      <w:r>
-        <w:rPr>
-          <w:rFonts w:eastAsia="Times New Roman"/>
-        </w:rPr>
-        <w:t>over the anime.</w:t>
-      </w:r>
-    </w:p>
-    <w:p>
-      <w:pPr>
-        <w:pStyle w:val="Normal"/>
-        <w:suppressLineNumbers w:val="0"/>
-        <w:bidi w:val="0"/>
-        <w:spacing w:before="0" w:beforeAutospacing="off" w:after="0" w:afterAutospacing="off" w:line="259" w:lineRule="auto"/>
-        <w:ind w:left="0" w:right="0"/>
-        <w:jc w:val="center"/>
-        <w:rPr>
-          <w:rFonts w:eastAsia="Times New Roman"/>
-        </w:rPr>
-      </w:pPr>
       <w:r>
         <w:rPr>
           <w:rFonts w:eastAsia="Times New Roman"/>
@@ -3193,23 +2704,26 @@
         </w:rPr>
       </w:pPr>
       <w:r>
+        <w:rPr>
+          <w:noProof/>
+        </w:rPr>
         <w:drawing>
-          <wp:inline wp14:editId="11AE14C8" wp14:anchorId="0C9E4B29">
+          <wp:inline distT="0" distB="0" distL="0" distR="0" wp14:anchorId="0C9E4B29" wp14:editId="11AE14C8">
             <wp:extent cx="1584678" cy="2377017"/>
             <wp:effectExtent l="0" t="0" r="0" b="0"/>
             <wp:docPr id="684548215" name="drawing"/>
             <wp:cNvGraphicFramePr>
-              <a:graphicFrameLocks noChangeAspect="1"/>
+              <a:graphicFrameLocks xmlns:a="http://schemas.openxmlformats.org/drawingml/2006/main" noChangeAspect="1"/>
             </wp:cNvGraphicFramePr>
-            <a:graphic>
-              <a:graphicData xmlns:a="http://schemas.openxmlformats.org/drawingml/2006/main" uri="http://schemas.openxmlformats.org/drawingml/2006/picture">
+            <a:graphic xmlns:a="http://schemas.openxmlformats.org/drawingml/2006/main">
+              <a:graphicData uri="http://schemas.openxmlformats.org/drawingml/2006/picture">
                 <pic:pic xmlns:pic="http://schemas.openxmlformats.org/drawingml/2006/picture">
                   <pic:nvPicPr>
                     <pic:cNvPr id="684548215" name="Picture 684548215"/>
                     <pic:cNvPicPr/>
                   </pic:nvPicPr>
                   <pic:blipFill>
-                    <a:blip xmlns:r="http://schemas.openxmlformats.org/officeDocument/2006/relationships" r:embed="rId1444622691">
+                    <a:blip r:embed="rId16">
                       <a:extLst>
                         <a:ext uri="{28A0092B-C50C-407E-A947-70E740481C1C}">
                           <a14:useLocalDpi xmlns:a14="http://schemas.microsoft.com/office/drawing/2010/main"/>
@@ -3221,7 +2735,7 @@
                     </a:stretch>
                   </pic:blipFill>
                   <pic:spPr>
-                    <a:xfrm rot="0">
+                    <a:xfrm>
                       <a:off x="0" y="0"/>
                       <a:ext cx="1584678" cy="2377017"/>
                     </a:xfrm>
@@ -3236,23 +2750,26 @@
         </w:drawing>
       </w:r>
       <w:r>
+        <w:rPr>
+          <w:noProof/>
+        </w:rPr>
         <w:drawing>
-          <wp:inline wp14:editId="2F1439D1" wp14:anchorId="0AAE6E0F">
+          <wp:inline distT="0" distB="0" distL="0" distR="0" wp14:anchorId="0AAE6E0F" wp14:editId="2F1439D1">
             <wp:extent cx="3170573" cy="2377930"/>
             <wp:effectExtent l="0" t="0" r="0" b="0"/>
             <wp:docPr id="1848517355" name="drawing"/>
             <wp:cNvGraphicFramePr>
-              <a:graphicFrameLocks noChangeAspect="1"/>
+              <a:graphicFrameLocks xmlns:a="http://schemas.openxmlformats.org/drawingml/2006/main" noChangeAspect="1"/>
             </wp:cNvGraphicFramePr>
-            <a:graphic>
-              <a:graphicData xmlns:a="http://schemas.openxmlformats.org/drawingml/2006/main" uri="http://schemas.openxmlformats.org/drawingml/2006/picture">
+            <a:graphic xmlns:a="http://schemas.openxmlformats.org/drawingml/2006/main">
+              <a:graphicData uri="http://schemas.openxmlformats.org/drawingml/2006/picture">
                 <pic:pic xmlns:pic="http://schemas.openxmlformats.org/drawingml/2006/picture">
                   <pic:nvPicPr>
                     <pic:cNvPr id="1848517355" name="Picture 1848517355"/>
                     <pic:cNvPicPr/>
                   </pic:nvPicPr>
                   <pic:blipFill>
-                    <a:blip xmlns:r="http://schemas.openxmlformats.org/officeDocument/2006/relationships" r:embed="rId1996671817">
+                    <a:blip r:embed="rId17">
                       <a:extLst>
                         <a:ext uri="{28A0092B-C50C-407E-A947-70E740481C1C}">
                           <a14:useLocalDpi xmlns:a14="http://schemas.microsoft.com/office/drawing/2010/main"/>
@@ -3264,7 +2781,7 @@
                     </a:stretch>
                   </pic:blipFill>
                   <pic:spPr>
-                    <a:xfrm rot="0">
+                    <a:xfrm>
                       <a:off x="0" y="0"/>
                       <a:ext cx="3170573" cy="2377930"/>
                     </a:xfrm>
@@ -3290,11 +2807,7 @@
     </w:p>
     <w:p>
       <w:pPr>
-        <w:pStyle w:val="Normal"/>
-        <w:suppressLineNumbers w:val="0"/>
-        <w:bidi w:val="0"/>
-        <w:spacing w:before="0" w:beforeAutospacing="off" w:after="0" w:afterAutospacing="off" w:line="259" w:lineRule="auto"/>
-        <w:ind/>
+        <w:spacing w:line="259" w:lineRule="auto"/>
         <w:jc w:val="center"/>
         <w:rPr>
           <w:rFonts w:eastAsia="Times New Roman"/>
@@ -3329,13 +2842,7 @@
         <w:rPr>
           <w:rFonts w:eastAsia="Times New Roman"/>
         </w:rPr>
-        <w:t>watched it.</w:t>
-      </w:r>
-      <w:r>
-        <w:rPr>
-          <w:rFonts w:eastAsia="Times New Roman"/>
-        </w:rPr>
-        <w:t xml:space="preserve"> This show is an American cartoon following the </w:t>
+        <w:t xml:space="preserve">watched it. This show is an American cartoon following the </w:t>
       </w:r>
       <w:r>
         <w:rPr>
@@ -3377,19 +2884,7 @@
         <w:rPr>
           <w:rFonts w:eastAsia="Times New Roman"/>
         </w:rPr>
-        <w:t xml:space="preserve"> Join Steven’s adventure as he learns about himself as well as his heritage as </w:t>
-      </w:r>
-      <w:r>
-        <w:rPr>
-          <w:rFonts w:eastAsia="Times New Roman"/>
-        </w:rPr>
-        <w:t>a Crystal</w:t>
-      </w:r>
-      <w:r>
-        <w:rPr>
-          <w:rFonts w:eastAsia="Times New Roman"/>
-        </w:rPr>
-        <w:t xml:space="preserve"> Gem and more.</w:t>
+        <w:t xml:space="preserve"> Join Steven’s adventure as he learns about himself as well as his heritage as a Crystal Gem and more.</w:t>
       </w:r>
       <w:r>
         <w:rPr>
@@ -3428,23 +2923,26 @@
         </w:rPr>
       </w:pPr>
       <w:r>
+        <w:rPr>
+          <w:noProof/>
+        </w:rPr>
         <w:drawing>
-          <wp:inline wp14:editId="4EFE9066" wp14:anchorId="2FB6D52A">
+          <wp:inline distT="0" distB="0" distL="0" distR="0" wp14:anchorId="2FB6D52A" wp14:editId="4EFE9066">
             <wp:extent cx="1519166" cy="2164292"/>
             <wp:effectExtent l="0" t="0" r="0" b="0"/>
             <wp:docPr id="1459276620" name="drawing"/>
             <wp:cNvGraphicFramePr>
-              <a:graphicFrameLocks noChangeAspect="1"/>
+              <a:graphicFrameLocks xmlns:a="http://schemas.openxmlformats.org/drawingml/2006/main" noChangeAspect="1"/>
             </wp:cNvGraphicFramePr>
-            <a:graphic>
-              <a:graphicData xmlns:a="http://schemas.openxmlformats.org/drawingml/2006/main" uri="http://schemas.openxmlformats.org/drawingml/2006/picture">
+            <a:graphic xmlns:a="http://schemas.openxmlformats.org/drawingml/2006/main">
+              <a:graphicData uri="http://schemas.openxmlformats.org/drawingml/2006/picture">
                 <pic:pic xmlns:pic="http://schemas.openxmlformats.org/drawingml/2006/picture">
                   <pic:nvPicPr>
                     <pic:cNvPr id="1459276620" name="Picture 1459276620"/>
                     <pic:cNvPicPr/>
                   </pic:nvPicPr>
                   <pic:blipFill>
-                    <a:blip xmlns:r="http://schemas.openxmlformats.org/officeDocument/2006/relationships" r:embed="rId8">
+                    <a:blip r:embed="rId18">
                       <a:extLst>
                         <a:ext uri="{28A0092B-C50C-407E-A947-70E740481C1C}">
                           <a14:useLocalDpi xmlns:a14="http://schemas.microsoft.com/office/drawing/2010/main"/>
@@ -3456,7 +2954,7 @@
                     </a:stretch>
                   </pic:blipFill>
                   <pic:spPr>
-                    <a:xfrm rot="0">
+                    <a:xfrm>
                       <a:off x="0" y="0"/>
                       <a:ext cx="1519166" cy="2164292"/>
                     </a:xfrm>
@@ -3471,23 +2969,26 @@
         </w:drawing>
       </w:r>
       <w:r>
+        <w:rPr>
+          <w:noProof/>
+        </w:rPr>
         <w:drawing>
-          <wp:inline wp14:editId="5ADFDB16" wp14:anchorId="1330DC1C">
+          <wp:inline distT="0" distB="0" distL="0" distR="0" wp14:anchorId="1330DC1C" wp14:editId="5ADFDB16">
             <wp:extent cx="3816152" cy="2146585"/>
             <wp:effectExtent l="0" t="0" r="0" b="0"/>
             <wp:docPr id="1958921513" name="drawing"/>
             <wp:cNvGraphicFramePr>
-              <a:graphicFrameLocks noChangeAspect="1"/>
+              <a:graphicFrameLocks xmlns:a="http://schemas.openxmlformats.org/drawingml/2006/main" noChangeAspect="1"/>
             </wp:cNvGraphicFramePr>
-            <a:graphic>
-              <a:graphicData xmlns:a="http://schemas.openxmlformats.org/drawingml/2006/main" uri="http://schemas.openxmlformats.org/drawingml/2006/picture">
+            <a:graphic xmlns:a="http://schemas.openxmlformats.org/drawingml/2006/main">
+              <a:graphicData uri="http://schemas.openxmlformats.org/drawingml/2006/picture">
                 <pic:pic xmlns:pic="http://schemas.openxmlformats.org/drawingml/2006/picture">
                   <pic:nvPicPr>
                     <pic:cNvPr id="1958921513" name="Picture 1958921513"/>
                     <pic:cNvPicPr/>
                   </pic:nvPicPr>
                   <pic:blipFill>
-                    <a:blip xmlns:r="http://schemas.openxmlformats.org/officeDocument/2006/relationships" r:embed="rId1883104603">
+                    <a:blip r:embed="rId19">
                       <a:extLst>
                         <a:ext uri="{28A0092B-C50C-407E-A947-70E740481C1C}">
                           <a14:useLocalDpi xmlns:a14="http://schemas.microsoft.com/office/drawing/2010/main"/>
@@ -3499,7 +3000,7 @@
                     </a:stretch>
                   </pic:blipFill>
                   <pic:spPr>
-                    <a:xfrm rot="0">
+                    <a:xfrm>
                       <a:off x="0" y="0"/>
                       <a:ext cx="3816152" cy="2146585"/>
                     </a:xfrm>
@@ -3539,8 +3040,8 @@
       <w:r>
         <w:rPr>
           <w:rFonts w:eastAsia="Times New Roman"/>
-          <w:b w:val="1"/>
-          <w:bCs w:val="1"/>
+          <w:b/>
+          <w:bCs/>
           <w:sz w:val="32"/>
           <w:szCs w:val="32"/>
         </w:rPr>
@@ -3549,8 +3050,8 @@
       <w:r>
         <w:rPr>
           <w:rFonts w:eastAsia="Times New Roman"/>
-          <w:b w:val="1"/>
-          <w:bCs w:val="1"/>
+          <w:b/>
+          <w:bCs/>
           <w:sz w:val="32"/>
           <w:szCs w:val="32"/>
         </w:rPr>
@@ -3562,8 +3063,8 @@
         <w:jc w:val="center"/>
         <w:rPr>
           <w:rFonts w:eastAsia="Times New Roman"/>
-          <w:b w:val="1"/>
-          <w:bCs w:val="1"/>
+          <w:b/>
+          <w:bCs/>
           <w:sz w:val="27"/>
           <w:szCs w:val="27"/>
         </w:rPr>
@@ -3571,8 +3072,8 @@
       <w:r>
         <w:rPr>
           <w:rFonts w:eastAsia="Times New Roman"/>
-          <w:b w:val="1"/>
-          <w:bCs w:val="1"/>
+          <w:b/>
+          <w:bCs/>
           <w:sz w:val="27"/>
           <w:szCs w:val="27"/>
         </w:rPr>
@@ -3584,30 +3085,29 @@
         <w:jc w:val="center"/>
         <w:rPr>
           <w:rFonts w:eastAsia="Times New Roman"/>
-          <w:b w:val="0"/>
-          <w:bCs w:val="0"/>
-          <w:sz w:val="24"/>
-          <w:szCs w:val="24"/>
-        </w:rPr>
-      </w:pPr>
-      <w:r>
+        </w:rPr>
+      </w:pPr>
+      <w:r>
+        <w:rPr>
+          <w:noProof/>
+        </w:rPr>
         <w:drawing>
-          <wp:inline wp14:editId="19C2D45B" wp14:anchorId="5859D44B">
-            <wp:extent cx="3187746" cy="4250326"/>
-            <wp:effectExtent l="0" t="0" r="0" b="0"/>
+          <wp:inline distT="0" distB="0" distL="0" distR="0" wp14:anchorId="5859D44B" wp14:editId="1C680297">
+            <wp:extent cx="5257800" cy="7010396"/>
+            <wp:effectExtent l="0" t="0" r="0" b="635"/>
             <wp:docPr id="1706336367" name="drawing"/>
             <wp:cNvGraphicFramePr>
-              <a:graphicFrameLocks noChangeAspect="1"/>
+              <a:graphicFrameLocks xmlns:a="http://schemas.openxmlformats.org/drawingml/2006/main" noChangeAspect="1"/>
             </wp:cNvGraphicFramePr>
-            <a:graphic>
-              <a:graphicData xmlns:a="http://schemas.openxmlformats.org/drawingml/2006/main" uri="http://schemas.openxmlformats.org/drawingml/2006/picture">
+            <a:graphic xmlns:a="http://schemas.openxmlformats.org/drawingml/2006/main">
+              <a:graphicData uri="http://schemas.openxmlformats.org/drawingml/2006/picture">
                 <pic:pic xmlns:pic="http://schemas.openxmlformats.org/drawingml/2006/picture">
                   <pic:nvPicPr>
                     <pic:cNvPr id="1706336367" name="Picture 1706336367"/>
                     <pic:cNvPicPr/>
                   </pic:nvPicPr>
                   <pic:blipFill>
-                    <a:blip xmlns:r="http://schemas.openxmlformats.org/officeDocument/2006/relationships" r:embed="rId965012662">
+                    <a:blip r:embed="rId20">
                       <a:extLst>
                         <a:ext uri="{28A0092B-C50C-407E-A947-70E740481C1C}">
                           <a14:useLocalDpi xmlns:a14="http://schemas.microsoft.com/office/drawing/2010/main"/>
@@ -3619,9 +3119,9 @@
                     </a:stretch>
                   </pic:blipFill>
                   <pic:spPr>
-                    <a:xfrm rot="0">
+                    <a:xfrm>
                       <a:off x="0" y="0"/>
-                      <a:ext cx="3187746" cy="4250326"/>
+                      <a:ext cx="5274205" cy="7032269"/>
                     </a:xfrm>
                     <a:prstGeom prst="rect">
                       <a:avLst/>
@@ -3639,20 +3139,16 @@
         <w:jc w:val="center"/>
         <w:rPr>
           <w:rFonts w:eastAsia="Times New Roman"/>
-          <w:b w:val="0"/>
-          <w:bCs w:val="0"/>
-          <w:sz w:val="24"/>
-          <w:szCs w:val="24"/>
-        </w:rPr>
-      </w:pPr>
-    </w:p>
-    <w:p>
-      <w:pPr>
-        <w:jc w:val="center"/>
-        <w:rPr>
-          <w:rFonts w:eastAsia="Times New Roman"/>
-          <w:b w:val="1"/>
-          <w:bCs w:val="1"/>
+        </w:rPr>
+      </w:pPr>
+    </w:p>
+    <w:p>
+      <w:pPr>
+        <w:jc w:val="center"/>
+        <w:rPr>
+          <w:rFonts w:eastAsia="Times New Roman"/>
+          <w:b/>
+          <w:bCs/>
           <w:sz w:val="27"/>
           <w:szCs w:val="27"/>
         </w:rPr>
@@ -3660,8 +3156,8 @@
       <w:r>
         <w:rPr>
           <w:rFonts w:eastAsia="Times New Roman"/>
-          <w:b w:val="1"/>
-          <w:bCs w:val="1"/>
+          <w:b/>
+          <w:bCs/>
           <w:sz w:val="27"/>
           <w:szCs w:val="27"/>
         </w:rPr>
@@ -3673,30 +3169,30 @@
         <w:jc w:val="center"/>
         <w:rPr>
           <w:rFonts w:eastAsia="Times New Roman"/>
-          <w:b w:val="0"/>
-          <w:bCs w:val="0"/>
-          <w:sz w:val="24"/>
-          <w:szCs w:val="24"/>
-        </w:rPr>
-      </w:pPr>
-      <w:r>
+        </w:rPr>
+      </w:pPr>
+      <w:r>
+        <w:rPr>
+          <w:noProof/>
+        </w:rPr>
+        <w:lastRenderedPageBreak/>
         <w:drawing>
-          <wp:inline wp14:editId="2508AE3A" wp14:anchorId="0991E5AE">
-            <wp:extent cx="3130557" cy="4174075"/>
-            <wp:effectExtent l="0" t="0" r="0" b="0"/>
+          <wp:inline distT="0" distB="0" distL="0" distR="0" wp14:anchorId="0991E5AE" wp14:editId="1B6456B3">
+            <wp:extent cx="5995512" cy="7994014"/>
+            <wp:effectExtent l="0" t="0" r="5715" b="7620"/>
             <wp:docPr id="308781244" name="drawing"/>
             <wp:cNvGraphicFramePr>
-              <a:graphicFrameLocks noChangeAspect="1"/>
+              <a:graphicFrameLocks xmlns:a="http://schemas.openxmlformats.org/drawingml/2006/main" noChangeAspect="1"/>
             </wp:cNvGraphicFramePr>
-            <a:graphic>
-              <a:graphicData xmlns:a="http://schemas.openxmlformats.org/drawingml/2006/main" uri="http://schemas.openxmlformats.org/drawingml/2006/picture">
+            <a:graphic xmlns:a="http://schemas.openxmlformats.org/drawingml/2006/main">
+              <a:graphicData uri="http://schemas.openxmlformats.org/drawingml/2006/picture">
                 <pic:pic xmlns:pic="http://schemas.openxmlformats.org/drawingml/2006/picture">
                   <pic:nvPicPr>
                     <pic:cNvPr id="308781244" name="Picture 308781244"/>
                     <pic:cNvPicPr/>
                   </pic:nvPicPr>
                   <pic:blipFill>
-                    <a:blip xmlns:r="http://schemas.openxmlformats.org/officeDocument/2006/relationships" r:embed="rId393728245">
+                    <a:blip r:embed="rId21">
                       <a:extLst>
                         <a:ext uri="{28A0092B-C50C-407E-A947-70E740481C1C}">
                           <a14:useLocalDpi xmlns:a14="http://schemas.microsoft.com/office/drawing/2010/main"/>
@@ -3708,9 +3204,9 @@
                     </a:stretch>
                   </pic:blipFill>
                   <pic:spPr>
-                    <a:xfrm rot="0">
+                    <a:xfrm>
                       <a:off x="0" y="0"/>
-                      <a:ext cx="3130557" cy="4174075"/>
+                      <a:ext cx="6012718" cy="8016956"/>
                     </a:xfrm>
                     <a:prstGeom prst="rect">
                       <a:avLst/>
@@ -3732,23 +3228,40 @@
       </w:pPr>
     </w:p>
     <w:sectPr>
-      <w:pgSz w:w="12240" w:h="15840" w:orient="portrait"/>
+      <w:headerReference w:type="default" r:id="rId22"/>
+      <w:footerReference w:type="default" r:id="rId23"/>
+      <w:pgSz w:w="12240" w:h="15840"/>
       <w:pgMar w:top="1440" w:right="1440" w:bottom="1440" w:left="1440" w:header="720" w:footer="720" w:gutter="0"/>
       <w:cols w:space="720"/>
       <w:docGrid w:linePitch="360"/>
-      <w:headerReference w:type="default" r:id="R788045b8ac1c49c2"/>
-      <w:footerReference w:type="default" r:id="Re2fb8bffdf614092"/>
     </w:sectPr>
   </w:body>
 </w:document>
 </file>
 
-<file path=word/footer.xml><?xml version="1.0" encoding="utf-8"?>
-<w:ftr xmlns:w14="http://schemas.microsoft.com/office/word/2010/wordml" xmlns:w="http://schemas.openxmlformats.org/wordprocessingml/2006/main">
+<file path=word/endnotes.xml><?xml version="1.0" encoding="utf-8"?>
+<w:endnotes xmlns:wpc="http://schemas.microsoft.com/office/word/2010/wordprocessingCanvas" xmlns:cx="http://schemas.microsoft.com/office/drawing/2014/chartex" xmlns:cx1="http://schemas.microsoft.com/office/drawing/2015/9/8/chartex" xmlns:cx2="http://schemas.microsoft.com/office/drawing/2015/10/21/chartex" xmlns:cx3="http://schemas.microsoft.com/office/drawing/2016/5/9/chartex" xmlns:cx4="http://schemas.microsoft.com/office/drawing/2016/5/10/chartex" xmlns:cx5="http://schemas.microsoft.com/office/drawing/2016/5/11/chartex" xmlns:cx6="http://schemas.microsoft.com/office/drawing/2016/5/12/chartex" xmlns:cx7="http://schemas.microsoft.com/office/drawing/2016/5/13/chartex" xmlns:cx8="http://schemas.microsoft.com/office/drawing/2016/5/14/chartex" xmlns:mc="http://schemas.openxmlformats.org/markup-compatibility/2006" xmlns:aink="http://schemas.microsoft.com/office/drawing/2016/ink" xmlns:am3d="http://schemas.microsoft.com/office/drawing/2017/model3d" xmlns:o="urn:schemas-microsoft-com:office:office" xmlns:oel="http://schemas.microsoft.com/office/2019/extlst" xmlns:r="http://schemas.openxmlformats.org/officeDocument/2006/relationships" xmlns:m="http://schemas.openxmlformats.org/officeDocument/2006/math" xmlns:v="urn:schemas-microsoft-com:vml" xmlns:wp14="http://schemas.microsoft.com/office/word/2010/wordprocessingDrawing" xmlns:wp="http://schemas.openxmlformats.org/drawingml/2006/wordprocessingDrawing" xmlns:w10="urn:schemas-microsoft-com:office:word" xmlns:w="http://schemas.openxmlformats.org/wordprocessingml/2006/main" xmlns:w14="http://schemas.microsoft.com/office/word/2010/wordml" xmlns:w15="http://schemas.microsoft.com/office/word/2012/wordml" xmlns:w16cex="http://schemas.microsoft.com/office/word/2018/wordml/cex" xmlns:w16cid="http://schemas.microsoft.com/office/word/2016/wordml/cid" xmlns:w16="http://schemas.microsoft.com/office/word/2018/wordml" xmlns:w16du="http://schemas.microsoft.com/office/word/2023/wordml/word16du" xmlns:w16sdtdh="http://schemas.microsoft.com/office/word/2020/wordml/sdtdatahash" xmlns:w16sdtfl="http://schemas.microsoft.com/office/word/2024/wordml/sdtformatlock" xmlns:w16se="http://schemas.microsoft.com/office/word/2015/wordml/symex" xmlns:wpg="http://schemas.microsoft.com/office/word/2010/wordprocessingGroup" xmlns:wpi="http://schemas.microsoft.com/office/word/2010/wordprocessingInk" xmlns:wne="http://schemas.microsoft.com/office/word/2006/wordml" xmlns:wps="http://schemas.microsoft.com/office/word/2010/wordprocessingShape" mc:Ignorable="w14 w15 w16se w16cid w16 w16cex w16sdtdh w16sdtfl w16du wp14">
+  <w:endnote w:type="separator" w:id="-1">
+    <w:p>
+      <w:r>
+        <w:separator/>
+      </w:r>
+    </w:p>
+  </w:endnote>
+  <w:endnote w:type="continuationSeparator" w:id="0">
+    <w:p>
+      <w:r>
+        <w:continuationSeparator/>
+      </w:r>
+    </w:p>
+  </w:endnote>
+</w:endnotes>
+</file>
+
+<file path=word/footer1.xml><?xml version="1.0" encoding="utf-8"?>
+<w:ftr xmlns:wpc="http://schemas.microsoft.com/office/word/2010/wordprocessingCanvas" xmlns:cx="http://schemas.microsoft.com/office/drawing/2014/chartex" xmlns:cx1="http://schemas.microsoft.com/office/drawing/2015/9/8/chartex" xmlns:cx2="http://schemas.microsoft.com/office/drawing/2015/10/21/chartex" xmlns:cx3="http://schemas.microsoft.com/office/drawing/2016/5/9/chartex" xmlns:cx4="http://schemas.microsoft.com/office/drawing/2016/5/10/chartex" xmlns:cx5="http://schemas.microsoft.com/office/drawing/2016/5/11/chartex" xmlns:cx6="http://schemas.microsoft.com/office/drawing/2016/5/12/chartex" xmlns:cx7="http://schemas.microsoft.com/office/drawing/2016/5/13/chartex" xmlns:cx8="http://schemas.microsoft.com/office/drawing/2016/5/14/chartex" xmlns:mc="http://schemas.openxmlformats.org/markup-compatibility/2006" xmlns:aink="http://schemas.microsoft.com/office/drawing/2016/ink" xmlns:am3d="http://schemas.microsoft.com/office/drawing/2017/model3d" xmlns:o="urn:schemas-microsoft-com:office:office" xmlns:oel="http://schemas.microsoft.com/office/2019/extlst" xmlns:r="http://schemas.openxmlformats.org/officeDocument/2006/relationships" xmlns:m="http://schemas.openxmlformats.org/officeDocument/2006/math" xmlns:v="urn:schemas-microsoft-com:vml" xmlns:wp14="http://schemas.microsoft.com/office/word/2010/wordprocessingDrawing" xmlns:wp="http://schemas.openxmlformats.org/drawingml/2006/wordprocessingDrawing" xmlns:w10="urn:schemas-microsoft-com:office:word" xmlns:w="http://schemas.openxmlformats.org/wordprocessingml/2006/main" xmlns:w14="http://schemas.microsoft.com/office/word/2010/wordml" xmlns:w15="http://schemas.microsoft.com/office/word/2012/wordml" xmlns:w16cex="http://schemas.microsoft.com/office/word/2018/wordml/cex" xmlns:w16cid="http://schemas.microsoft.com/office/word/2016/wordml/cid" xmlns:w16="http://schemas.microsoft.com/office/word/2018/wordml" xmlns:w16du="http://schemas.microsoft.com/office/word/2023/wordml/word16du" xmlns:w16sdtdh="http://schemas.microsoft.com/office/word/2020/wordml/sdtdatahash" xmlns:w16sdtfl="http://schemas.microsoft.com/office/word/2024/wordml/sdtformatlock" xmlns:w16se="http://schemas.microsoft.com/office/word/2015/wordml/symex" xmlns:wpg="http://schemas.microsoft.com/office/word/2010/wordprocessingGroup" xmlns:wpi="http://schemas.microsoft.com/office/word/2010/wordprocessingInk" xmlns:wne="http://schemas.microsoft.com/office/word/2006/wordml" xmlns:wps="http://schemas.microsoft.com/office/word/2010/wordprocessingShape" mc:Ignorable="w14 w15 w16se w16cid w16 w16cex w16sdtdh w16sdtfl w16du wp14">
   <w:tbl>
     <w:tblPr>
-      <w:tblStyle w:val="TableNormal"/>
-      <w:bidiVisual w:val="0"/>
       <w:tblW w:w="0" w:type="auto"/>
       <w:tblLook w:val="06A0" w:firstRow="1" w:lastRow="0" w:firstColumn="1" w:lastColumn="0" w:noHBand="1" w:noVBand="1"/>
     </w:tblPr>
@@ -3764,26 +3277,21 @@
       <w:tc>
         <w:tcPr>
           <w:tcW w:w="3120" w:type="dxa"/>
-          <w:tcMar/>
         </w:tcPr>
         <w:p>
           <w:pPr>
             <w:pStyle w:val="Header"/>
-            <w:bidi w:val="0"/>
             <w:ind w:left="-115"/>
-            <w:jc w:val="left"/>
           </w:pPr>
         </w:p>
       </w:tc>
       <w:tc>
         <w:tcPr>
           <w:tcW w:w="3120" w:type="dxa"/>
-          <w:tcMar/>
         </w:tcPr>
         <w:p>
           <w:pPr>
             <w:pStyle w:val="Header"/>
-            <w:bidi w:val="0"/>
             <w:jc w:val="center"/>
           </w:pPr>
         </w:p>
@@ -3791,12 +3299,10 @@
       <w:tc>
         <w:tcPr>
           <w:tcW w:w="3120" w:type="dxa"/>
-          <w:tcMar/>
         </w:tcPr>
         <w:p>
           <w:pPr>
             <w:pStyle w:val="Header"/>
-            <w:bidi w:val="0"/>
             <w:ind w:right="-115"/>
             <w:jc w:val="right"/>
           </w:pPr>
@@ -3808,12 +3314,29 @@
 </w:ftr>
 </file>
 
-<file path=word/header.xml><?xml version="1.0" encoding="utf-8"?>
-<w:hdr xmlns:w14="http://schemas.microsoft.com/office/word/2010/wordml" xmlns:w="http://schemas.openxmlformats.org/wordprocessingml/2006/main">
+<file path=word/footnotes.xml><?xml version="1.0" encoding="utf-8"?>
+<w:footnotes xmlns:wpc="http://schemas.microsoft.com/office/word/2010/wordprocessingCanvas" xmlns:cx="http://schemas.microsoft.com/office/drawing/2014/chartex" xmlns:cx1="http://schemas.microsoft.com/office/drawing/2015/9/8/chartex" xmlns:cx2="http://schemas.microsoft.com/office/drawing/2015/10/21/chartex" xmlns:cx3="http://schemas.microsoft.com/office/drawing/2016/5/9/chartex" xmlns:cx4="http://schemas.microsoft.com/office/drawing/2016/5/10/chartex" xmlns:cx5="http://schemas.microsoft.com/office/drawing/2016/5/11/chartex" xmlns:cx6="http://schemas.microsoft.com/office/drawing/2016/5/12/chartex" xmlns:cx7="http://schemas.microsoft.com/office/drawing/2016/5/13/chartex" xmlns:cx8="http://schemas.microsoft.com/office/drawing/2016/5/14/chartex" xmlns:mc="http://schemas.openxmlformats.org/markup-compatibility/2006" xmlns:aink="http://schemas.microsoft.com/office/drawing/2016/ink" xmlns:am3d="http://schemas.microsoft.com/office/drawing/2017/model3d" xmlns:o="urn:schemas-microsoft-com:office:office" xmlns:oel="http://schemas.microsoft.com/office/2019/extlst" xmlns:r="http://schemas.openxmlformats.org/officeDocument/2006/relationships" xmlns:m="http://schemas.openxmlformats.org/officeDocument/2006/math" xmlns:v="urn:schemas-microsoft-com:vml" xmlns:wp14="http://schemas.microsoft.com/office/word/2010/wordprocessingDrawing" xmlns:wp="http://schemas.openxmlformats.org/drawingml/2006/wordprocessingDrawing" xmlns:w10="urn:schemas-microsoft-com:office:word" xmlns:w="http://schemas.openxmlformats.org/wordprocessingml/2006/main" xmlns:w14="http://schemas.microsoft.com/office/word/2010/wordml" xmlns:w15="http://schemas.microsoft.com/office/word/2012/wordml" xmlns:w16cex="http://schemas.microsoft.com/office/word/2018/wordml/cex" xmlns:w16cid="http://schemas.microsoft.com/office/word/2016/wordml/cid" xmlns:w16="http://schemas.microsoft.com/office/word/2018/wordml" xmlns:w16du="http://schemas.microsoft.com/office/word/2023/wordml/word16du" xmlns:w16sdtdh="http://schemas.microsoft.com/office/word/2020/wordml/sdtdatahash" xmlns:w16sdtfl="http://schemas.microsoft.com/office/word/2024/wordml/sdtformatlock" xmlns:w16se="http://schemas.microsoft.com/office/word/2015/wordml/symex" xmlns:wpg="http://schemas.microsoft.com/office/word/2010/wordprocessingGroup" xmlns:wpi="http://schemas.microsoft.com/office/word/2010/wordprocessingInk" xmlns:wne="http://schemas.microsoft.com/office/word/2006/wordml" xmlns:wps="http://schemas.microsoft.com/office/word/2010/wordprocessingShape" mc:Ignorable="w14 w15 w16se w16cid w16 w16cex w16sdtdh w16sdtfl w16du wp14">
+  <w:footnote w:type="separator" w:id="-1">
+    <w:p>
+      <w:r>
+        <w:separator/>
+      </w:r>
+    </w:p>
+  </w:footnote>
+  <w:footnote w:type="continuationSeparator" w:id="0">
+    <w:p>
+      <w:r>
+        <w:continuationSeparator/>
+      </w:r>
+    </w:p>
+  </w:footnote>
+</w:footnotes>
+</file>
+
+<file path=word/header1.xml><?xml version="1.0" encoding="utf-8"?>
+<w:hdr xmlns:wpc="http://schemas.microsoft.com/office/word/2010/wordprocessingCanvas" xmlns:cx="http://schemas.microsoft.com/office/drawing/2014/chartex" xmlns:cx1="http://schemas.microsoft.com/office/drawing/2015/9/8/chartex" xmlns:cx2="http://schemas.microsoft.com/office/drawing/2015/10/21/chartex" xmlns:cx3="http://schemas.microsoft.com/office/drawing/2016/5/9/chartex" xmlns:cx4="http://schemas.microsoft.com/office/drawing/2016/5/10/chartex" xmlns:cx5="http://schemas.microsoft.com/office/drawing/2016/5/11/chartex" xmlns:cx6="http://schemas.microsoft.com/office/drawing/2016/5/12/chartex" xmlns:cx7="http://schemas.microsoft.com/office/drawing/2016/5/13/chartex" xmlns:cx8="http://schemas.microsoft.com/office/drawing/2016/5/14/chartex" xmlns:mc="http://schemas.openxmlformats.org/markup-compatibility/2006" xmlns:aink="http://schemas.microsoft.com/office/drawing/2016/ink" xmlns:am3d="http://schemas.microsoft.com/office/drawing/2017/model3d" xmlns:o="urn:schemas-microsoft-com:office:office" xmlns:oel="http://schemas.microsoft.com/office/2019/extlst" xmlns:r="http://schemas.openxmlformats.org/officeDocument/2006/relationships" xmlns:m="http://schemas.openxmlformats.org/officeDocument/2006/math" xmlns:v="urn:schemas-microsoft-com:vml" xmlns:wp14="http://schemas.microsoft.com/office/word/2010/wordprocessingDrawing" xmlns:wp="http://schemas.openxmlformats.org/drawingml/2006/wordprocessingDrawing" xmlns:w10="urn:schemas-microsoft-com:office:word" xmlns:w="http://schemas.openxmlformats.org/wordprocessingml/2006/main" xmlns:w14="http://schemas.microsoft.com/office/word/2010/wordml" xmlns:w15="http://schemas.microsoft.com/office/word/2012/wordml" xmlns:w16cex="http://schemas.microsoft.com/office/word/2018/wordml/cex" xmlns:w16cid="http://schemas.microsoft.com/office/word/2016/wordml/cid" xmlns:w16="http://schemas.microsoft.com/office/word/2018/wordml" xmlns:w16du="http://schemas.microsoft.com/office/word/2023/wordml/word16du" xmlns:w16sdtdh="http://schemas.microsoft.com/office/word/2020/wordml/sdtdatahash" xmlns:w16sdtfl="http://schemas.microsoft.com/office/word/2024/wordml/sdtformatlock" xmlns:w16se="http://schemas.microsoft.com/office/word/2015/wordml/symex" xmlns:wpg="http://schemas.microsoft.com/office/word/2010/wordprocessingGroup" xmlns:wpi="http://schemas.microsoft.com/office/word/2010/wordprocessingInk" xmlns:wne="http://schemas.microsoft.com/office/word/2006/wordml" xmlns:wps="http://schemas.microsoft.com/office/word/2010/wordprocessingShape" mc:Ignorable="w14 w15 w16se w16cid w16 w16cex w16sdtdh w16sdtfl w16du wp14">
   <w:tbl>
     <w:tblPr>
-      <w:tblStyle w:val="TableNormal"/>
-      <w:bidiVisual w:val="0"/>
       <w:tblW w:w="0" w:type="auto"/>
       <w:tblLook w:val="06A0" w:firstRow="1" w:lastRow="0" w:firstColumn="1" w:lastColumn="0" w:noHBand="1" w:noVBand="1"/>
     </w:tblPr>
@@ -3829,26 +3352,21 @@
       <w:tc>
         <w:tcPr>
           <w:tcW w:w="3120" w:type="dxa"/>
-          <w:tcMar/>
         </w:tcPr>
         <w:p>
           <w:pPr>
             <w:pStyle w:val="Header"/>
-            <w:bidi w:val="0"/>
             <w:ind w:left="-115"/>
-            <w:jc w:val="left"/>
           </w:pPr>
         </w:p>
       </w:tc>
       <w:tc>
         <w:tcPr>
           <w:tcW w:w="3120" w:type="dxa"/>
-          <w:tcMar/>
         </w:tcPr>
         <w:p>
           <w:pPr>
             <w:pStyle w:val="Header"/>
-            <w:bidi w:val="0"/>
             <w:jc w:val="center"/>
           </w:pPr>
         </w:p>
@@ -3856,12 +3374,10 @@
       <w:tc>
         <w:tcPr>
           <w:tcW w:w="3120" w:type="dxa"/>
-          <w:tcMar/>
         </w:tcPr>
         <w:p>
           <w:pPr>
             <w:pStyle w:val="Header"/>
-            <w:bidi w:val="0"/>
             <w:ind w:right="-115"/>
             <w:jc w:val="right"/>
           </w:pPr>
@@ -3872,7 +3388,6 @@
   <w:p>
     <w:pPr>
       <w:pStyle w:val="Header"/>
-      <w:bidi w:val="0"/>
     </w:pPr>
   </w:p>
 </w:hdr>
@@ -3882,10 +3397,10 @@
 <int2:intelligence xmlns:int2="http://schemas.microsoft.com/office/intelligence/2020/intelligence" xmlns:oel="http://schemas.microsoft.com/office/2019/extlst">
   <int2:observations>
     <int2:textHash int2:hashCode="wgAymEvYlM6ec3" int2:id="5FqmxwC1">
-      <int2:state int2:type="spell" int2:value="Rejected"/>
+      <int2:state int2:value="Rejected" int2:type="spell"/>
     </int2:textHash>
     <int2:textHash int2:hashCode="+0LdnZMo8zjzCL" int2:id="UWbCT3jU">
-      <int2:state int2:type="spell" int2:value="Rejected"/>
+      <int2:state int2:value="Rejected" int2:type="spell"/>
     </int2:textHash>
   </int2:observations>
   <int2:intelligenceSettings/>
@@ -3898,7 +3413,7 @@
   <w:docDefaults>
     <w:rPrDefault>
       <w:rPr>
-        <w:rFonts w:ascii="Times New Roman" w:hAnsi="Times New Roman" w:eastAsia="Times New Roman" w:cs="Times New Roman"/>
+        <w:rFonts w:ascii="Times New Roman" w:eastAsia="Times New Roman" w:hAnsi="Times New Roman" w:cs="Times New Roman"/>
         <w:lang w:val="en-US" w:eastAsia="zh-CN" w:bidi="ar-SA"/>
       </w:rPr>
     </w:rPrDefault>
@@ -3910,11 +3425,11 @@
     <w:lsdException w:name="heading 2" w:uiPriority="9" w:qFormat="1"/>
     <w:lsdException w:name="heading 3" w:uiPriority="9" w:qFormat="1"/>
     <w:lsdException w:name="heading 4" w:uiPriority="9" w:qFormat="1"/>
-    <w:lsdException w:name="heading 5" w:uiPriority="9" w:semiHidden="1" w:unhideWhenUsed="1" w:qFormat="1"/>
-    <w:lsdException w:name="heading 6" w:uiPriority="9" w:semiHidden="1" w:unhideWhenUsed="1" w:qFormat="1"/>
-    <w:lsdException w:name="heading 7" w:uiPriority="9" w:semiHidden="1" w:unhideWhenUsed="1" w:qFormat="1"/>
-    <w:lsdException w:name="heading 8" w:uiPriority="9" w:semiHidden="1" w:unhideWhenUsed="1" w:qFormat="1"/>
-    <w:lsdException w:name="heading 9" w:uiPriority="9" w:semiHidden="1" w:unhideWhenUsed="1" w:qFormat="1"/>
+    <w:lsdException w:name="heading 5" w:semiHidden="1" w:uiPriority="9" w:unhideWhenUsed="1" w:qFormat="1"/>
+    <w:lsdException w:name="heading 6" w:semiHidden="1" w:uiPriority="9" w:unhideWhenUsed="1" w:qFormat="1"/>
+    <w:lsdException w:name="heading 7" w:semiHidden="1" w:uiPriority="9" w:unhideWhenUsed="1" w:qFormat="1"/>
+    <w:lsdException w:name="heading 8" w:semiHidden="1" w:uiPriority="9" w:unhideWhenUsed="1" w:qFormat="1"/>
+    <w:lsdException w:name="heading 9" w:semiHidden="1" w:uiPriority="9" w:unhideWhenUsed="1" w:qFormat="1"/>
     <w:lsdException w:name="index 1" w:semiHidden="1" w:unhideWhenUsed="1"/>
     <w:lsdException w:name="index 2" w:semiHidden="1" w:unhideWhenUsed="1"/>
     <w:lsdException w:name="index 3" w:semiHidden="1" w:unhideWhenUsed="1"/>
@@ -3924,22 +3439,22 @@
     <w:lsdException w:name="index 7" w:semiHidden="1" w:unhideWhenUsed="1"/>
     <w:lsdException w:name="index 8" w:semiHidden="1" w:unhideWhenUsed="1"/>
     <w:lsdException w:name="index 9" w:semiHidden="1" w:unhideWhenUsed="1"/>
-    <w:lsdException w:name="toc 1" w:uiPriority="39" w:semiHidden="1" w:unhideWhenUsed="1"/>
-    <w:lsdException w:name="toc 2" w:uiPriority="39" w:semiHidden="1" w:unhideWhenUsed="1"/>
-    <w:lsdException w:name="toc 3" w:uiPriority="39" w:semiHidden="1" w:unhideWhenUsed="1"/>
-    <w:lsdException w:name="toc 4" w:uiPriority="39" w:semiHidden="1" w:unhideWhenUsed="1"/>
-    <w:lsdException w:name="toc 5" w:uiPriority="39" w:semiHidden="1" w:unhideWhenUsed="1"/>
-    <w:lsdException w:name="toc 6" w:uiPriority="39" w:semiHidden="1" w:unhideWhenUsed="1"/>
-    <w:lsdException w:name="toc 7" w:uiPriority="39" w:semiHidden="1" w:unhideWhenUsed="1"/>
-    <w:lsdException w:name="toc 8" w:uiPriority="39" w:semiHidden="1" w:unhideWhenUsed="1"/>
-    <w:lsdException w:name="toc 9" w:uiPriority="39" w:semiHidden="1" w:unhideWhenUsed="1"/>
+    <w:lsdException w:name="toc 1" w:semiHidden="1" w:uiPriority="39" w:unhideWhenUsed="1"/>
+    <w:lsdException w:name="toc 2" w:semiHidden="1" w:uiPriority="39" w:unhideWhenUsed="1"/>
+    <w:lsdException w:name="toc 3" w:semiHidden="1" w:uiPriority="39" w:unhideWhenUsed="1"/>
+    <w:lsdException w:name="toc 4" w:semiHidden="1" w:uiPriority="39" w:unhideWhenUsed="1"/>
+    <w:lsdException w:name="toc 5" w:semiHidden="1" w:uiPriority="39" w:unhideWhenUsed="1"/>
+    <w:lsdException w:name="toc 6" w:semiHidden="1" w:uiPriority="39" w:unhideWhenUsed="1"/>
+    <w:lsdException w:name="toc 7" w:semiHidden="1" w:uiPriority="39" w:unhideWhenUsed="1"/>
+    <w:lsdException w:name="toc 8" w:semiHidden="1" w:uiPriority="39" w:unhideWhenUsed="1"/>
+    <w:lsdException w:name="toc 9" w:semiHidden="1" w:uiPriority="39" w:unhideWhenUsed="1"/>
     <w:lsdException w:name="Normal Indent" w:semiHidden="1" w:unhideWhenUsed="1"/>
     <w:lsdException w:name="footnote text" w:semiHidden="1" w:unhideWhenUsed="1"/>
     <w:lsdException w:name="annotation text" w:semiHidden="1" w:unhideWhenUsed="1"/>
     <w:lsdException w:name="header" w:semiHidden="1" w:unhideWhenUsed="1"/>
     <w:lsdException w:name="footer" w:semiHidden="1" w:unhideWhenUsed="1"/>
     <w:lsdException w:name="index heading" w:semiHidden="1" w:unhideWhenUsed="1"/>
-    <w:lsdException w:name="caption" w:uiPriority="35" w:semiHidden="1" w:unhideWhenUsed="1" w:qFormat="1"/>
+    <w:lsdException w:name="caption" w:semiHidden="1" w:uiPriority="35" w:unhideWhenUsed="1" w:qFormat="1"/>
     <w:lsdException w:name="table of figures" w:semiHidden="1" w:unhideWhenUsed="1"/>
     <w:lsdException w:name="envelope address" w:semiHidden="1" w:unhideWhenUsed="1"/>
     <w:lsdException w:name="envelope return" w:semiHidden="1" w:unhideWhenUsed="1"/>
@@ -3970,7 +3485,7 @@
     <w:lsdException w:name="Title" w:uiPriority="10" w:qFormat="1"/>
     <w:lsdException w:name="Closing" w:semiHidden="1" w:unhideWhenUsed="1"/>
     <w:lsdException w:name="Signature" w:semiHidden="1" w:unhideWhenUsed="1"/>
-    <w:lsdException w:name="Default Paragraph Font" w:uiPriority="1" w:semiHidden="1" w:unhideWhenUsed="1"/>
+    <w:lsdException w:name="Default Paragraph Font" w:semiHidden="1" w:uiPriority="1" w:unhideWhenUsed="1"/>
     <w:lsdException w:name="Body Text" w:semiHidden="1" w:unhideWhenUsed="1"/>
     <w:lsdException w:name="Body Text Indent" w:semiHidden="1" w:unhideWhenUsed="1"/>
     <w:lsdException w:name="List Continue" w:semiHidden="1" w:unhideWhenUsed="1"/>
@@ -4170,8 +3685,8 @@
     <w:lsdException w:name="Subtle Reference" w:uiPriority="31" w:qFormat="1"/>
     <w:lsdException w:name="Intense Reference" w:uiPriority="32" w:qFormat="1"/>
     <w:lsdException w:name="Book Title" w:uiPriority="33" w:qFormat="1"/>
-    <w:lsdException w:name="Bibliography" w:uiPriority="37" w:semiHidden="1" w:unhideWhenUsed="1"/>
-    <w:lsdException w:name="TOC Heading" w:uiPriority="39" w:semiHidden="1" w:unhideWhenUsed="1" w:qFormat="1"/>
+    <w:lsdException w:name="Bibliography" w:semiHidden="1" w:uiPriority="37" w:unhideWhenUsed="1"/>
+    <w:lsdException w:name="TOC Heading" w:semiHidden="1" w:uiPriority="39" w:unhideWhenUsed="1" w:qFormat="1"/>
     <w:lsdException w:name="Plain Table 1" w:uiPriority="41"/>
     <w:lsdException w:name="Plain Table 2" w:uiPriority="42"/>
     <w:lsdException w:name="Plain Table 3" w:uiPriority="43"/>
@@ -4282,7 +3797,7 @@
     <w:lsdException w:name="Unresolved Mention" w:semiHidden="1" w:unhideWhenUsed="1"/>
     <w:lsdException w:name="Smart Link" w:semiHidden="1" w:unhideWhenUsed="1"/>
   </w:latentStyles>
-  <w:style w:type="paragraph" w:styleId="Normal" w:default="1">
+  <w:style w:type="paragraph" w:default="1" w:styleId="Normal">
     <w:name w:val="Normal"/>
     <w:qFormat/>
     <w:rPr>
@@ -4358,13 +3873,13 @@
       <w:bCs/>
     </w:rPr>
   </w:style>
-  <w:style w:type="character" w:styleId="DefaultParagraphFont" w:default="1">
+  <w:style w:type="character" w:default="1" w:styleId="DefaultParagraphFont">
     <w:name w:val="Default Paragraph Font"/>
     <w:uiPriority w:val="1"/>
     <w:semiHidden/>
     <w:unhideWhenUsed/>
   </w:style>
-  <w:style w:type="table" w:styleId="TableNormal" w:default="1">
+  <w:style w:type="table" w:default="1" w:styleId="TableNormal">
     <w:name w:val="Normal Table"/>
     <w:uiPriority w:val="99"/>
     <w:semiHidden/>
@@ -4379,52 +3894,52 @@
       </w:tblCellMar>
     </w:tblPr>
   </w:style>
-  <w:style w:type="numbering" w:styleId="NoList" w:default="1">
+  <w:style w:type="numbering" w:default="1" w:styleId="NoList">
     <w:name w:val="No List"/>
     <w:uiPriority w:val="99"/>
     <w:semiHidden/>
     <w:unhideWhenUsed/>
   </w:style>
-  <w:style w:type="paragraph" w:styleId="msonormal0" w:customStyle="1">
+  <w:style w:type="paragraph" w:customStyle="1" w:styleId="msonormal0">
     <w:name w:val="msonormal"/>
     <w:basedOn w:val="Normal"/>
     <w:pPr>
       <w:spacing w:before="100" w:beforeAutospacing="1" w:after="100" w:afterAutospacing="1"/>
     </w:pPr>
   </w:style>
-  <w:style w:type="character" w:styleId="Heading1Char" w:customStyle="1">
+  <w:style w:type="character" w:customStyle="1" w:styleId="Heading1Char">
     <w:name w:val="Heading 1 Char"/>
     <w:basedOn w:val="DefaultParagraphFont"/>
     <w:link w:val="Heading1"/>
     <w:uiPriority w:val="9"/>
     <w:rPr>
-      <w:rFonts w:asciiTheme="majorHAnsi" w:hAnsiTheme="majorHAnsi" w:eastAsiaTheme="majorEastAsia" w:cstheme="majorBidi"/>
+      <w:rFonts w:asciiTheme="majorHAnsi" w:eastAsiaTheme="majorEastAsia" w:hAnsiTheme="majorHAnsi" w:cstheme="majorBidi"/>
       <w:color w:val="2F5496" w:themeColor="accent1" w:themeShade="BF"/>
       <w:sz w:val="32"/>
       <w:szCs w:val="32"/>
     </w:rPr>
   </w:style>
-  <w:style w:type="character" w:styleId="Heading2Char" w:customStyle="1">
+  <w:style w:type="character" w:customStyle="1" w:styleId="Heading2Char">
     <w:name w:val="Heading 2 Char"/>
     <w:basedOn w:val="DefaultParagraphFont"/>
     <w:link w:val="Heading2"/>
     <w:uiPriority w:val="9"/>
     <w:semiHidden/>
     <w:rPr>
-      <w:rFonts w:asciiTheme="majorHAnsi" w:hAnsiTheme="majorHAnsi" w:eastAsiaTheme="majorEastAsia" w:cstheme="majorBidi"/>
+      <w:rFonts w:asciiTheme="majorHAnsi" w:eastAsiaTheme="majorEastAsia" w:hAnsiTheme="majorHAnsi" w:cstheme="majorBidi"/>
       <w:color w:val="2F5496" w:themeColor="accent1" w:themeShade="BF"/>
       <w:sz w:val="26"/>
       <w:szCs w:val="26"/>
     </w:rPr>
   </w:style>
-  <w:style w:type="character" w:styleId="Heading3Char" w:customStyle="1">
+  <w:style w:type="character" w:customStyle="1" w:styleId="Heading3Char">
     <w:name w:val="Heading 3 Char"/>
     <w:basedOn w:val="DefaultParagraphFont"/>
     <w:link w:val="Heading3"/>
     <w:uiPriority w:val="9"/>
     <w:semiHidden/>
     <w:rPr>
-      <w:rFonts w:asciiTheme="majorHAnsi" w:hAnsiTheme="majorHAnsi" w:eastAsiaTheme="majorEastAsia" w:cstheme="majorBidi"/>
+      <w:rFonts w:asciiTheme="majorHAnsi" w:eastAsiaTheme="majorEastAsia" w:hAnsiTheme="majorHAnsi" w:cstheme="majorBidi"/>
       <w:color w:val="1F3763" w:themeColor="accent1" w:themeShade="7F"/>
       <w:sz w:val="24"/>
       <w:szCs w:val="24"/>
@@ -4440,14 +3955,14 @@
       <w:spacing w:before="100" w:beforeAutospacing="1" w:after="100" w:afterAutospacing="1"/>
     </w:pPr>
   </w:style>
-  <w:style w:type="character" w:styleId="Heading4Char" w:customStyle="1">
+  <w:style w:type="character" w:customStyle="1" w:styleId="Heading4Char">
     <w:name w:val="Heading 4 Char"/>
     <w:basedOn w:val="DefaultParagraphFont"/>
     <w:link w:val="Heading4"/>
     <w:uiPriority w:val="9"/>
     <w:semiHidden/>
     <w:rPr>
-      <w:rFonts w:asciiTheme="majorHAnsi" w:hAnsiTheme="majorHAnsi" w:eastAsiaTheme="majorEastAsia" w:cstheme="majorBidi"/>
+      <w:rFonts w:asciiTheme="majorHAnsi" w:eastAsiaTheme="majorEastAsia" w:hAnsiTheme="majorHAnsi" w:cstheme="majorBidi"/>
       <w:i/>
       <w:iCs/>
       <w:color w:val="2F5496" w:themeColor="accent1" w:themeShade="BF"/>
@@ -4455,7 +3970,7 @@
       <w:szCs w:val="24"/>
     </w:rPr>
   </w:style>
-  <w:style w:type="paragraph" w:styleId="colored" w:customStyle="1">
+  <w:style w:type="paragraph" w:customStyle="1" w:styleId="colored">
     <w:name w:val="colored"/>
     <w:basedOn w:val="Normal"/>
     <w:pPr>
@@ -4484,50 +3999,39 @@
     </w:rPr>
   </w:style>
   <w:style w:type="paragraph" w:styleId="Header">
-    <w:uiPriority w:val="99"/>
     <w:name w:val="header"/>
     <w:basedOn w:val="Normal"/>
+    <w:uiPriority w:val="99"/>
     <w:unhideWhenUsed/>
     <w:rsid w:val="5DD3B401"/>
     <w:pPr>
       <w:tabs>
-        <w:tab w:val="center" w:leader="none" w:pos="4680"/>
-        <w:tab w:val="right" w:leader="none" w:pos="9360"/>
+        <w:tab w:val="center" w:pos="4680"/>
+        <w:tab w:val="right" w:pos="9360"/>
       </w:tabs>
-      <w:spacing w:after="0" w:line="240" w:lineRule="auto"/>
     </w:pPr>
   </w:style>
-  <w:style xmlns:w="http://schemas.openxmlformats.org/wordprocessingml/2006/main" w:type="table" w:styleId="TableGrid">
-    <w:name xmlns:w="http://schemas.openxmlformats.org/wordprocessingml/2006/main" w:val="Table Grid"/>
-    <w:basedOn xmlns:w="http://schemas.openxmlformats.org/wordprocessingml/2006/main" w:val="TableNormal"/>
-    <w:uiPriority xmlns:w="http://schemas.openxmlformats.org/wordprocessingml/2006/main" w:val="59"/>
-    <w:rsid xmlns:w="http://schemas.openxmlformats.org/wordprocessingml/2006/main" w:val="00FB4123"/>
-    <w:pPr xmlns:w="http://schemas.openxmlformats.org/wordprocessingml/2006/main">
-      <w:spacing w:after="0" w:line="240" w:lineRule="auto"/>
-    </w:pPr>
-    <w:tblPr xmlns:w="http://schemas.openxmlformats.org/wordprocessingml/2006/main">
-      <w:tblInd w:w="0" w:type="dxa"/>
+  <w:style w:type="table" w:styleId="TableGrid">
+    <w:name w:val="Table Grid"/>
+    <w:basedOn w:val="TableNormal"/>
+    <w:uiPriority w:val="59"/>
+    <w:rsid w:val="00FB4123"/>
+    <w:tblPr>
       <w:tblBorders>
-        <w:top w:val="single" w:color="000000" w:themeColor="text1" w:sz="4" w:space="0"/>
-        <w:left w:val="single" w:color="000000" w:themeColor="text1" w:sz="4" w:space="0"/>
-        <w:bottom w:val="single" w:color="000000" w:themeColor="text1" w:sz="4" w:space="0"/>
-        <w:right w:val="single" w:color="000000" w:themeColor="text1" w:sz="4" w:space="0"/>
-        <w:insideH w:val="single" w:color="000000" w:themeColor="text1" w:sz="4" w:space="0"/>
-        <w:insideV w:val="single" w:color="000000" w:themeColor="text1" w:sz="4" w:space="0"/>
+        <w:top w:val="single" w:sz="4" w:space="0" w:color="000000" w:themeColor="text1"/>
+        <w:left w:val="single" w:sz="4" w:space="0" w:color="000000" w:themeColor="text1"/>
+        <w:bottom w:val="single" w:sz="4" w:space="0" w:color="000000" w:themeColor="text1"/>
+        <w:right w:val="single" w:sz="4" w:space="0" w:color="000000" w:themeColor="text1"/>
+        <w:insideH w:val="single" w:sz="4" w:space="0" w:color="000000" w:themeColor="text1"/>
+        <w:insideV w:val="single" w:sz="4" w:space="0" w:color="000000" w:themeColor="text1"/>
       </w:tblBorders>
-      <w:tblCellMar>
-        <w:top w:w="0" w:type="dxa"/>
-        <w:left w:w="108" w:type="dxa"/>
-        <w:bottom w:w="0" w:type="dxa"/>
-        <w:right w:w="108" w:type="dxa"/>
-      </w:tblCellMar>
     </w:tblPr>
   </w:style>
 </w:styles>
 </file>
 
 <file path=word/theme/theme1.xml><?xml version="1.0" encoding="utf-8"?>
-<a:theme xmlns:a="http://schemas.openxmlformats.org/drawingml/2006/main" xmlns:thm15="http://schemas.microsoft.com/office/thememl/2012/main" name="Office Theme">
+<a:theme xmlns:a="http://schemas.openxmlformats.org/drawingml/2006/main" name="Office Theme">
   <a:themeElements>
     <a:clrScheme name="Office">
       <a:dk1>

</xml_diff>

<commit_message>
updated the anime html and css
</commit_message>
<xml_diff>
--- a/cruz-site-plan (anime) (1).docx
+++ b/cruz-site-plan (anime) (1).docx
@@ -4334,15 +4334,6 @@
 </file>
 
 <file path=customXml/item2.xml><?xml version="1.0" encoding="utf-8"?>
-<?mso-contentType ?>
-<FormTemplates xmlns="http://schemas.microsoft.com/sharepoint/v3/contenttype/forms">
-  <Display>DocumentLibraryForm</Display>
-  <Edit>DocumentLibraryForm</Edit>
-  <New>DocumentLibraryForm</New>
-</FormTemplates>
-</file>
-
-<file path=customXml/item3.xml><?xml version="1.0" encoding="utf-8"?>
 <ct:contentTypeSchema xmlns:ct="http://schemas.microsoft.com/office/2006/metadata/contentType" xmlns:ma="http://schemas.microsoft.com/office/2006/metadata/properties/metaAttributes" ct:_="" ma:_="" ma:contentTypeName="Document" ma:contentTypeID="0x0101005D6135EF373B8843913C665194AD5E82" ma:contentTypeVersion="6" ma:contentTypeDescription="Create a new document." ma:contentTypeScope="" ma:versionID="ab6cad1ed27c72be1c51f1d4655d5d15">
   <xsd:schema xmlns:xsd="http://www.w3.org/2001/XMLSchema" xmlns:xs="http://www.w3.org/2001/XMLSchema" xmlns:p="http://schemas.microsoft.com/office/2006/metadata/properties" xmlns:ns3="0cdabaf2-6e23-408d-b483-c5cf8ba4598b" targetNamespace="http://schemas.microsoft.com/office/2006/metadata/properties" ma:root="true" ma:fieldsID="5d892a4bc92a485b0f893eb696f2a0d2" ns3:_="">
     <xsd:import namespace="0cdabaf2-6e23-408d-b483-c5cf8ba4598b"/>
@@ -4498,6 +4489,15 @@
 </ct:contentTypeSchema>
 </file>
 
+<file path=customXml/item3.xml><?xml version="1.0" encoding="utf-8"?>
+<?mso-contentType ?>
+<FormTemplates xmlns="http://schemas.microsoft.com/sharepoint/v3/contenttype/forms">
+  <Display>DocumentLibraryForm</Display>
+  <Edit>DocumentLibraryForm</Edit>
+  <New>DocumentLibraryForm</New>
+</FormTemplates>
+</file>
+
 <file path=customXml/itemProps1.xml><?xml version="1.0" encoding="utf-8"?>
 <ds:datastoreItem xmlns:ds="http://schemas.openxmlformats.org/officeDocument/2006/customXml" ds:itemID="{6EBF1B0C-C47F-4210-AE3E-DFB6A6F83377}">
   <ds:schemaRefs>
@@ -4509,14 +4509,6 @@
 </file>
 
 <file path=customXml/itemProps2.xml><?xml version="1.0" encoding="utf-8"?>
-<ds:datastoreItem xmlns:ds="http://schemas.openxmlformats.org/officeDocument/2006/customXml" ds:itemID="{59B9A1BE-326E-4F5D-B73D-6A6605C1034F}">
-  <ds:schemaRefs>
-    <ds:schemaRef ds:uri="http://schemas.microsoft.com/sharepoint/v3/contenttype/forms"/>
-  </ds:schemaRefs>
-</ds:datastoreItem>
-</file>
-
-<file path=customXml/itemProps3.xml><?xml version="1.0" encoding="utf-8"?>
 <ds:datastoreItem xmlns:ds="http://schemas.openxmlformats.org/officeDocument/2006/customXml" ds:itemID="{6A725066-4F98-4060-AF15-9EE1148E778B}">
   <ds:schemaRefs>
     <ds:schemaRef ds:uri="http://schemas.microsoft.com/office/2006/metadata/contentType"/>
@@ -4532,4 +4524,12 @@
     <ds:schemaRef ds:uri="http://schemas.microsoft.com/internal/obd"/>
   </ds:schemaRefs>
 </ds:datastoreItem>
+</file>
+
+<file path=customXml/itemProps3.xml><?xml version="1.0" encoding="utf-8"?>
+<ds:datastoreItem xmlns:ds="http://schemas.openxmlformats.org/officeDocument/2006/customXml" ds:itemID="{59B9A1BE-326E-4F5D-B73D-6A6605C1034F}">
+  <ds:schemaRefs>
+    <ds:schemaRef ds:uri="http://schemas.microsoft.com/sharepoint/v3/contenttype/forms"/>
+  </ds:schemaRefs>
+</ds:datastoreItem>
 </file>
</xml_diff>